<commit_message>
Embed all three original high-resolution figures into report.md and re-compile report.docx successfully
</commit_message>
<xml_diff>
--- a/report/report.docx
+++ b/report/report.docx
@@ -563,6 +563,68 @@
           <w:sz w:val="24"/>
         </w:rPr>
         <w:t>). This represents a severe violation of logical coherence, posing critical safety risks in autonomous systems, robotics, and agentic workflows where spatial commitments trigger physical actions.</w:t>
+      </w:r>
+    </w:p>
+    <w:p>
+      <w:pPr>
+        <w:spacing w:after="80"/>
+      </w:pPr>
+    </w:p>
+    <w:p>
+      <w:pPr>
+        <w:spacing w:before="160" w:after="40"/>
+        <w:jc w:val="center"/>
+      </w:pPr>
+      <w:r>
+        <w:drawing>
+          <wp:inline xmlns:a="http://schemas.openxmlformats.org/drawingml/2006/main" xmlns:pic="http://schemas.openxmlformats.org/drawingml/2006/picture">
+            <wp:extent cx="4572000" cy="2476930"/>
+            <wp:docPr id="1" name="Picture 1"/>
+            <wp:cNvGraphicFramePr>
+              <a:graphicFrameLocks noChangeAspect="1"/>
+            </wp:cNvGraphicFramePr>
+            <a:graphic>
+              <a:graphicData uri="http://schemas.openxmlformats.org/drawingml/2006/picture">
+                <pic:pic>
+                  <pic:nvPicPr>
+                    <pic:cNvPr id="0" name="figure1.png"/>
+                    <pic:cNvPicPr/>
+                  </pic:nvPicPr>
+                  <pic:blipFill>
+                    <a:blip r:embed="rId9"/>
+                    <a:stretch>
+                      <a:fillRect/>
+                    </a:stretch>
+                  </pic:blipFill>
+                  <pic:spPr>
+                    <a:xfrm>
+                      <a:off x="0" y="0"/>
+                      <a:ext cx="4572000" cy="2476930"/>
+                    </a:xfrm>
+                    <a:prstGeom prst="rect"/>
+                  </pic:spPr>
+                </pic:pic>
+              </a:graphicData>
+            </a:graphic>
+          </wp:inline>
+        </w:drawing>
+      </w:r>
+    </w:p>
+    <w:p>
+      <w:pPr>
+        <w:keepNext/>
+        <w:spacing w:before="40" w:after="240"/>
+        <w:jc w:val="center"/>
+      </w:pPr>
+      <w:r>
+        <w:rPr>
+          <w:rFonts w:ascii="Times New Roman" w:hAnsi="Times New Roman"/>
+          <w:b w:val="0"/>
+          <w:i/>
+          <w:color w:val="646E78"/>
+          <w:sz w:val="20"/>
+        </w:rPr>
+        <w:t>Figure 1: An example of Existence-Localization Contradiction.</w:t>
       </w:r>
     </w:p>
     <w:p>
@@ -3688,6 +3750,68 @@
     </w:p>
     <w:p>
       <w:pPr>
+        <w:spacing w:before="160" w:after="40"/>
+        <w:jc w:val="center"/>
+      </w:pPr>
+      <w:r>
+        <w:drawing>
+          <wp:inline xmlns:a="http://schemas.openxmlformats.org/drawingml/2006/main" xmlns:pic="http://schemas.openxmlformats.org/drawingml/2006/picture">
+            <wp:extent cx="3657600" cy="2471351"/>
+            <wp:docPr id="2" name="Picture 2"/>
+            <wp:cNvGraphicFramePr>
+              <a:graphicFrameLocks noChangeAspect="1"/>
+            </wp:cNvGraphicFramePr>
+            <a:graphic>
+              <a:graphicData uri="http://schemas.openxmlformats.org/drawingml/2006/picture">
+                <pic:pic>
+                  <pic:nvPicPr>
+                    <pic:cNvPr id="0" name="figure2.png"/>
+                    <pic:cNvPicPr/>
+                  </pic:nvPicPr>
+                  <pic:blipFill>
+                    <a:blip r:embed="rId10"/>
+                    <a:stretch>
+                      <a:fillRect/>
+                    </a:stretch>
+                  </pic:blipFill>
+                  <pic:spPr>
+                    <a:xfrm>
+                      <a:off x="0" y="0"/>
+                      <a:ext cx="3657600" cy="2471351"/>
+                    </a:xfrm>
+                    <a:prstGeom prst="rect"/>
+                  </pic:spPr>
+                </pic:pic>
+              </a:graphicData>
+            </a:graphic>
+          </wp:inline>
+        </w:drawing>
+      </w:r>
+    </w:p>
+    <w:p>
+      <w:pPr>
+        <w:keepNext/>
+        <w:spacing w:before="40" w:after="240"/>
+        <w:jc w:val="center"/>
+      </w:pPr>
+      <w:r>
+        <w:rPr>
+          <w:rFonts w:ascii="Times New Roman" w:hAnsi="Times New Roman"/>
+          <w:b w:val="0"/>
+          <w:i/>
+          <w:color w:val="646E78"/>
+          <w:sz w:val="20"/>
+        </w:rPr>
+        <w:t>Figure 2: PCA projection of hidden states at the final token position.</w:t>
+      </w:r>
+    </w:p>
+    <w:p>
+      <w:pPr>
+        <w:spacing w:after="80"/>
+      </w:pPr>
+    </w:p>
+    <w:p>
+      <w:pPr>
         <w:spacing w:after="160" w:line="276" w:lineRule="auto"/>
         <w:jc w:val="left"/>
       </w:pPr>
@@ -4497,6 +4621,68 @@
           <w:sz w:val="20"/>
         </w:rPr>
         <w:t xml:space="preserve">         -0.8 -0.5 -0.2 0.0 0.4 0.8 1.2 1.6</w:t>
+      </w:r>
+    </w:p>
+    <w:p>
+      <w:pPr>
+        <w:spacing w:after="80"/>
+      </w:pPr>
+    </w:p>
+    <w:p>
+      <w:pPr>
+        <w:spacing w:before="160" w:after="40"/>
+        <w:jc w:val="center"/>
+      </w:pPr>
+      <w:r>
+        <w:drawing>
+          <wp:inline xmlns:a="http://schemas.openxmlformats.org/drawingml/2006/main" xmlns:pic="http://schemas.openxmlformats.org/drawingml/2006/picture">
+            <wp:extent cx="3657600" cy="1058779"/>
+            <wp:docPr id="3" name="Picture 3"/>
+            <wp:cNvGraphicFramePr>
+              <a:graphicFrameLocks noChangeAspect="1"/>
+            </wp:cNvGraphicFramePr>
+            <a:graphic>
+              <a:graphicData uri="http://schemas.openxmlformats.org/drawingml/2006/picture">
+                <pic:pic>
+                  <pic:nvPicPr>
+                    <pic:cNvPr id="0" name="figure3.png"/>
+                    <pic:cNvPicPr/>
+                  </pic:nvPicPr>
+                  <pic:blipFill>
+                    <a:blip r:embed="rId11"/>
+                    <a:stretch>
+                      <a:fillRect/>
+                    </a:stretch>
+                  </pic:blipFill>
+                  <pic:spPr>
+                    <a:xfrm>
+                      <a:off x="0" y="0"/>
+                      <a:ext cx="3657600" cy="1058779"/>
+                    </a:xfrm>
+                    <a:prstGeom prst="rect"/>
+                  </pic:spPr>
+                </pic:pic>
+              </a:graphicData>
+            </a:graphic>
+          </wp:inline>
+        </w:drawing>
+      </w:r>
+    </w:p>
+    <w:p>
+      <w:pPr>
+        <w:keepNext/>
+        <w:spacing w:before="40" w:after="240"/>
+        <w:jc w:val="center"/>
+      </w:pPr>
+      <w:r>
+        <w:rPr>
+          <w:rFonts w:ascii="Times New Roman" w:hAnsi="Times New Roman"/>
+          <w:b w:val="0"/>
+          <w:i/>
+          <w:color w:val="646E78"/>
+          <w:sz w:val="20"/>
+        </w:rPr>
+        <w:t>Figure 3: Model performance under different steering coefficients.</w:t>
       </w:r>
     </w:p>
     <w:p>

</xml_diff>

<commit_message>
Swap contribution roles and reflections for Bac and Phuong in report.md and report.docx
</commit_message>
<xml_diff>
--- a/report/report.docx
+++ b/report/report.docx
@@ -216,7 +216,7 @@
           <w:color w:val="000000"/>
           <w:sz w:val="24"/>
         </w:rPr>
-        <w:t>Role: Preprocessing &amp; Pipeline Architecture</w:t>
+        <w:t>Role: Activation Steering &amp; Mitigation</w:t>
       </w:r>
       <w:r>
         <w:rPr>
@@ -344,7 +344,7 @@
           <w:color w:val="000000"/>
           <w:sz w:val="24"/>
         </w:rPr>
-        <w:t>Role: Activation Steering &amp; Mitigation</w:t>
+        <w:t>Role: Preprocessing &amp; Pipeline Architecture</w:t>
       </w:r>
       <w:r>
         <w:rPr>
@@ -5975,17 +5975,17 @@
           <w:color w:val="000000"/>
           <w:sz w:val="24"/>
         </w:rPr>
-        <w:t>Nguyen Ba Thanh Bac (Preprocessing &amp; Pipeline)</w:t>
-      </w:r>
-      <w:r>
-        <w:rPr>
-          <w:rFonts w:ascii="Times New Roman" w:hAnsi="Times New Roman"/>
-          <w:b w:val="0"/>
-          <w:i w:val="0"/>
-          <w:color w:val="000000"/>
-          <w:sz w:val="24"/>
-        </w:rPr>
-        <w:t>: Set up the repository architecture (`/data/`, `/scripts/`, `/report/`). Developed the regex coordinate parser and dataset loaders for POPE, AMBER, MME, and DASH-B. Coded the 2-Stage Conditional Protocol and evaluated baseline performance.</w:t>
+        <w:t>Nguyen Ba Thanh Bac (Activation Steering)</w:t>
+      </w:r>
+      <w:r>
+        <w:rPr>
+          <w:rFonts w:ascii="Times New Roman" w:hAnsi="Times New Roman"/>
+          <w:b w:val="0"/>
+          <w:i w:val="0"/>
+          <w:color w:val="000000"/>
+          <w:sz w:val="24"/>
+        </w:rPr>
+        <w:t>: Designed the latent steering algorithm. Integrated EasySteer to construct contrastive steer directions. Conducted the grid search over scaling factor $\alpha$ and layers, and built the final interactive Jupyter Playground.</w:t>
       </w:r>
     </w:p>
     <w:p>
@@ -6045,17 +6045,17 @@
           <w:color w:val="000000"/>
           <w:sz w:val="24"/>
         </w:rPr>
-        <w:t>Tran Thi Hoai Phuong (Activation Steering)</w:t>
-      </w:r>
-      <w:r>
-        <w:rPr>
-          <w:rFonts w:ascii="Times New Roman" w:hAnsi="Times New Roman"/>
-          <w:b w:val="0"/>
-          <w:i w:val="0"/>
-          <w:color w:val="000000"/>
-          <w:sz w:val="24"/>
-        </w:rPr>
-        <w:t>: Designed the latent steering algorithm. Integrated EasySteer to construct contrastive steer directions. Conducted the grid search over scaling factor $\alpha$ and layers, and built the final interactive Jupyter Playground.</w:t>
+        <w:t>Tran Thi Hoai Phuong (Preprocessing &amp; Pipeline)</w:t>
+      </w:r>
+      <w:r>
+        <w:rPr>
+          <w:rFonts w:ascii="Times New Roman" w:hAnsi="Times New Roman"/>
+          <w:b w:val="0"/>
+          <w:i w:val="0"/>
+          <w:color w:val="000000"/>
+          <w:sz w:val="24"/>
+        </w:rPr>
+        <w:t>: Set up the repository architecture (`/data/`, `/scripts/`, `/report/`). Developed the regex coordinate parser and dataset loaders for POPE, AMBER, MME, and DASH-B. Coded the 2-Stage Conditional Protocol and evaluated baseline performance.</w:t>
       </w:r>
     </w:p>
     <w:p>
@@ -6118,7 +6118,7 @@
           <w:color w:val="7C3AED"/>
           <w:sz w:val="24"/>
         </w:rPr>
-        <w:t>6.1 Reflection by Nguyen Ba Thanh Bac (Preprocessing &amp; Pipeline)</w:t>
+        <w:t>6.1 Reflection by Nguyen Ba Thanh Bac (Activation Steering)</w:t>
       </w:r>
     </w:p>
     <w:p>
@@ -6134,7 +6134,7 @@
           <w:color w:val="000000"/>
           <w:sz w:val="24"/>
         </w:rPr>
-        <w:t>"In this project, my primary role was setting up the pipeline architecture and pre-processing the diverse datasets. I designed the unified data loader and implemented regular expression patterns to extract bounding boxes from diverse output formats. A major challenge was parsing Qwen’s natural coordinates compared to InternVL’s `&lt;ref&gt;` XML tag format, which frequently caused string-index errors. Overcoming this taught me the importance of robust data sanitization and output validation in VLM evaluation. I gained deep knowledge of visual grounding benchmarks and learned how structural formatting impacts generative models. In the future, I plan to research structured schema constraints (like Instructor or Outlines) during decoding to completely prevent malformed coordinate generations." (120 words)</w:t>
+        <w:t>"As the steering and mitigation lead, I developed the lightweight inference-time steering engine. I integrated the EasySteer framework, computed the contrastive difference vectors, and injected the steering vector. My largest obstacle was managing the trade-off between increasing CELF on negative samples and preventing over-abstention on positive grounding tasks. Conducting a systematic grid search over layers 7-13 and coefficient $\alpha$ allowed me to identify the optimal layer-scale trade-off. This project deepened my understanding of representation engineering and causal latent manipulation without expensive fine-tuning. In the future, I will focus on developing dynamic, input-adaptive steering mechanisms that adjust $\alpha$ automatically based on model confidence." (115 words)</w:t>
       </w:r>
     </w:p>
     <w:p>
@@ -6192,7 +6192,7 @@
           <w:color w:val="7C3AED"/>
           <w:sz w:val="24"/>
         </w:rPr>
-        <w:t>6.3 Reflection by Tran Thi Hoai Phuong (Activation Steering)</w:t>
+        <w:t>6.3 Reflection by Tran Thi Hoai Phuong (Preprocessing &amp; Pipeline)</w:t>
       </w:r>
     </w:p>
     <w:p>
@@ -6208,7 +6208,7 @@
           <w:color w:val="000000"/>
           <w:sz w:val="24"/>
         </w:rPr>
-        <w:t>"As the steering and mitigation lead, I developed the lightweight inference-time steering engine. I integrated the EasySteer framework, computed the contrastive difference vectors, and injected the steering vector. My largest obstacle was managing the trade-off between increasing CELF on negative samples and preventing over-abstention on positive grounding tasks. Conducting a systematic grid search over layers 7-13 and coefficient $\alpha$ allowed me to identify the optimal layer-scale trade-off. This project deepened my understanding of representation engineering and causal latent manipulation without expensive fine-tuning. In the future, I will focus on developing dynamic, input-adaptive steering mechanisms that adjust $\alpha$ automatically based on model confidence." (115 words)</w:t>
+        <w:t>"In this project, my primary role was setting up the pipeline architecture and pre-processing the diverse datasets. I designed the unified data loader and implemented regular expression patterns to extract bounding boxes from diverse output formats. A major challenge was parsing Qwen’s natural coordinates compared to InternVL’s `&lt;ref&gt;` XML tag format, which frequently caused string-index errors. Overcoming this taught me the importance of robust data sanitization and output validation in VLM evaluation. I gained deep knowledge of visual grounding benchmarks and learned how structural formatting impacts generative models. In the future, I plan to research structured schema constraints (like Instructor or Outlines) during decoding to completely prevent malformed coordinate generations." (120 words)</w:t>
       </w:r>
     </w:p>
     <w:p>

</xml_diff>

<commit_message>
Update reports with swapped roles, clean formatting, and correct GitHub branch link
</commit_message>
<xml_diff>
--- a/report/report.docx
+++ b/report/report.docx
@@ -216,7 +216,7 @@
           <w:color w:val="000000"/>
           <w:sz w:val="24"/>
         </w:rPr>
-        <w:t>Role: Activation Steering &amp; Mitigation</w:t>
+        <w:t>Role: Preprocessing &amp; Pipeline Architecture</w:t>
       </w:r>
       <w:r>
         <w:rPr>
@@ -344,7 +344,7 @@
           <w:color w:val="000000"/>
           <w:sz w:val="24"/>
         </w:rPr>
-        <w:t>Role: Preprocessing &amp; Pipeline Architecture</w:t>
+        <w:t>Role: Activation Steering &amp; Mitigation</w:t>
       </w:r>
       <w:r>
         <w:rPr>
@@ -393,7 +393,7 @@
           <w:color w:val="000000"/>
           <w:sz w:val="24"/>
         </w:rPr>
-        <w:t xml:space="preserve"> [https://github.com/Phuongtran75/Project_NLP](https://github.com/Phuongtran75/Project_NLP)</w:t>
+        <w:t xml:space="preserve"> https://github.com/Phuongtran75/Project_NLP/tree/main</w:t>
       </w:r>
     </w:p>
     <w:p>
@@ -408,32 +408,27 @@
     </w:p>
     <w:p>
       <w:pPr>
-        <w:spacing w:after="80"/>
-      </w:pPr>
+        <w:keepNext/>
+        <w:spacing w:before="280" w:after="120"/>
+      </w:pPr>
+      <w:r>
+        <w:rPr>
+          <w:rFonts w:ascii="Times New Roman" w:hAnsi="Times New Roman"/>
+          <w:b/>
+          <w:i w:val="0"/>
+          <w:color w:val="0E7490"/>
+          <w:sz w:val="28"/>
+        </w:rPr>
+        <w:t>Introduction</w:t>
+      </w:r>
     </w:p>
     <w:p>
       <w:pPr>
-        <w:keepNext/>
-        <w:spacing w:before="280" w:after="120"/>
-      </w:pPr>
-      <w:r>
-        <w:rPr>
-          <w:rFonts w:ascii="Times New Roman" w:hAnsi="Times New Roman"/>
-          <w:b/>
-          <w:i w:val="0"/>
-          <w:color w:val="0E7490"/>
-          <w:sz w:val="28"/>
-        </w:rPr>
-        <w:t>1. Introduction</w:t>
-      </w:r>
+        <w:spacing w:after="80"/>
+      </w:pPr>
     </w:p>
     <w:p>
       <w:pPr>
-        <w:spacing w:after="80"/>
-      </w:pPr>
-    </w:p>
-    <w:p>
-      <w:pPr>
         <w:keepNext/>
         <w:spacing w:before="200" w:after="80"/>
       </w:pPr>
@@ -445,7 +440,7 @@
           <w:color w:val="7C3AED"/>
           <w:sz w:val="24"/>
         </w:rPr>
-        <w:t>1.1 Multimodal NLP and Spatial Grounding Task Definition</w:t>
+        <w:t>Multimodal NLP and Spatial Grounding Task Definition</w:t>
       </w:r>
     </w:p>
     <w:p>
@@ -645,7 +640,7 @@
           <w:color w:val="7C3AED"/>
           <w:sz w:val="24"/>
         </w:rPr>
-        <w:t>1.2 Dataset Origins and Description</w:t>
+        <w:t>Dataset Origins and Description</w:t>
       </w:r>
     </w:p>
     <w:p>
@@ -822,7 +817,7 @@
           <w:color w:val="7C3AED"/>
           <w:sz w:val="24"/>
         </w:rPr>
-        <w:t>1.3 Motivation and Challenges</w:t>
+        <w:t>Motivation and Challenges</w:t>
       </w:r>
     </w:p>
     <w:p>
@@ -1079,18 +1074,18 @@
     </w:p>
     <w:p>
       <w:pPr>
-        <w:spacing w:after="240"/>
-        <w:jc w:val="center"/>
-      </w:pPr>
-      <w:r>
-        <w:rPr>
-          <w:rFonts w:ascii="Times New Roman" w:hAnsi="Times New Roman"/>
-          <w:b w:val="0"/>
-          <w:i w:val="0"/>
-          <w:color w:val="C8C8C8"/>
-          <w:sz w:val="20"/>
-        </w:rPr>
-        <w:t>__________________________________________________________________</w:t>
+        <w:keepNext/>
+        <w:spacing w:before="280" w:after="120"/>
+      </w:pPr>
+      <w:r>
+        <w:rPr>
+          <w:rFonts w:ascii="Times New Roman" w:hAnsi="Times New Roman"/>
+          <w:b/>
+          <w:i w:val="0"/>
+          <w:color w:val="0E7490"/>
+          <w:sz w:val="28"/>
+        </w:rPr>
+        <w:t>Research Questions and NLP Tasks</w:t>
       </w:r>
     </w:p>
     <w:p>
@@ -1100,18 +1095,18 @@
     </w:p>
     <w:p>
       <w:pPr>
-        <w:keepNext/>
-        <w:spacing w:before="280" w:after="120"/>
-      </w:pPr>
-      <w:r>
-        <w:rPr>
-          <w:rFonts w:ascii="Times New Roman" w:hAnsi="Times New Roman"/>
-          <w:b/>
-          <w:i w:val="0"/>
-          <w:color w:val="0E7490"/>
-          <w:sz w:val="28"/>
-        </w:rPr>
-        <w:t>2. Research Questions and NLP Tasks</w:t>
+        <w:spacing w:after="160" w:line="276" w:lineRule="auto"/>
+        <w:jc w:val="left"/>
+      </w:pPr>
+      <w:r>
+        <w:rPr>
+          <w:rFonts w:ascii="Times New Roman" w:hAnsi="Times New Roman"/>
+          <w:b w:val="0"/>
+          <w:i w:val="0"/>
+          <w:color w:val="000000"/>
+          <w:sz w:val="24"/>
+        </w:rPr>
+        <w:t>Our investigation is structured around three core Research Questions (RQs) representing our three project sub-tasks:</w:t>
       </w:r>
     </w:p>
     <w:p>
@@ -1121,24 +1116,35 @@
     </w:p>
     <w:p>
       <w:pPr>
-        <w:spacing w:after="160" w:line="276" w:lineRule="auto"/>
-        <w:jc w:val="left"/>
-      </w:pPr>
-      <w:r>
-        <w:rPr>
-          <w:rFonts w:ascii="Times New Roman" w:hAnsi="Times New Roman"/>
+        <w:spacing w:after="40"/>
+        <w:ind w:left="720"/>
+      </w:pPr>
+      <w:r>
+        <w:rPr>
+          <w:rFonts w:ascii="Consolas" w:hAnsi="Consolas"/>
           <w:b w:val="0"/>
           <w:i w:val="0"/>
-          <w:color w:val="000000"/>
-          <w:sz w:val="24"/>
-        </w:rPr>
-        <w:t>Our investigation is structured around three core Research Questions (RQs) representing our three project sub-tasks:</w:t>
+          <w:color w:val="646E78"/>
+          <w:sz w:val="20"/>
+        </w:rPr>
+        <w:t>graph TD</w:t>
       </w:r>
     </w:p>
     <w:p>
       <w:pPr>
-        <w:spacing w:after="80"/>
-      </w:pPr>
+        <w:spacing w:after="40"/>
+        <w:ind w:left="720"/>
+      </w:pPr>
+      <w:r>
+        <w:rPr>
+          <w:rFonts w:ascii="Consolas" w:hAnsi="Consolas"/>
+          <w:b w:val="0"/>
+          <w:i w:val="0"/>
+          <w:color w:val="646E78"/>
+          <w:sz w:val="20"/>
+        </w:rPr>
+        <w:t xml:space="preserve">    A[Image + Query Object] --&gt; B[VQA: Is there a cat?]</w:t>
+      </w:r>
     </w:p>
     <w:p>
       <w:pPr>
@@ -1153,7 +1159,7 @@
           <w:color w:val="646E78"/>
           <w:sz w:val="20"/>
         </w:rPr>
-        <w:t>graph TD</w:t>
+        <w:t xml:space="preserve">    A --&gt; C[Grounding: Locate the cat]</w:t>
       </w:r>
     </w:p>
     <w:p>
@@ -1169,7 +1175,7 @@
           <w:color w:val="646E78"/>
           <w:sz w:val="20"/>
         </w:rPr>
-        <w:t xml:space="preserve">    A[Image + Query Object] --&gt; B[VQA: Is there a cat?]</w:t>
+        <w:t xml:space="preserve">    B --&gt;|Model: No| D[Correct Absence]</w:t>
       </w:r>
     </w:p>
     <w:p>
@@ -1185,7 +1191,7 @@
           <w:color w:val="646E78"/>
           <w:sz w:val="20"/>
         </w:rPr>
-        <w:t xml:space="preserve">    A --&gt; C[Grounding: Locate the cat]</w:t>
+        <w:t xml:space="preserve">    C --&gt;|Model: Draws box| E[Existence-Localization Contradiction]</w:t>
       </w:r>
     </w:p>
     <w:p>
@@ -1201,7 +1207,7 @@
           <w:color w:val="646E78"/>
           <w:sz w:val="20"/>
         </w:rPr>
-        <w:t xml:space="preserve">    B --&gt;|Model: No| D[Correct Absence]</w:t>
+        <w:t xml:space="preserve">    D --&gt; F{Task 1: Eval Baseline CELF}</w:t>
       </w:r>
     </w:p>
     <w:p>
@@ -1217,7 +1223,7 @@
           <w:color w:val="646E78"/>
           <w:sz w:val="20"/>
         </w:rPr>
-        <w:t xml:space="preserve">    C --&gt;|Model: Draws box| E[Existence-Localization Contradiction]</w:t>
+        <w:t xml:space="preserve">    E --&gt; F</w:t>
       </w:r>
     </w:p>
     <w:p>
@@ -1233,7 +1239,7 @@
           <w:color w:val="646E78"/>
           <w:sz w:val="20"/>
         </w:rPr>
-        <w:t xml:space="preserve">    D --&gt; F{Task 1: Eval Baseline CELF}</w:t>
+        <w:t xml:space="preserve">    F --&gt; G{Task 2: PCA Representation Probing}</w:t>
       </w:r>
     </w:p>
     <w:p>
@@ -1249,7 +1255,7 @@
           <w:color w:val="646E78"/>
           <w:sz w:val="20"/>
         </w:rPr>
-        <w:t xml:space="preserve">    E --&gt; F</w:t>
+        <w:t xml:space="preserve">    G --&gt; H{Task 3: Latent Activation Steering}</w:t>
       </w:r>
     </w:p>
     <w:p>
@@ -1265,48 +1271,16 @@
           <w:color w:val="646E78"/>
           <w:sz w:val="20"/>
         </w:rPr>
-        <w:t xml:space="preserve">    F --&gt; G{Task 2: PCA Representation Probing}</w:t>
+        <w:t xml:space="preserve">    H --&gt; I[Absence-Consistent Refusal]</w:t>
       </w:r>
     </w:p>
     <w:p>
       <w:pPr>
-        <w:spacing w:after="40"/>
-        <w:ind w:left="720"/>
-      </w:pPr>
-      <w:r>
-        <w:rPr>
-          <w:rFonts w:ascii="Consolas" w:hAnsi="Consolas"/>
-          <w:b w:val="0"/>
-          <w:i w:val="0"/>
-          <w:color w:val="646E78"/>
-          <w:sz w:val="20"/>
-        </w:rPr>
-        <w:t xml:space="preserve">    G --&gt; H{Task 3: Latent Activation Steering}</w:t>
-      </w:r>
+        <w:spacing w:after="80"/>
+      </w:pPr>
     </w:p>
     <w:p>
       <w:pPr>
-        <w:spacing w:after="40"/>
-        <w:ind w:left="720"/>
-      </w:pPr>
-      <w:r>
-        <w:rPr>
-          <w:rFonts w:ascii="Consolas" w:hAnsi="Consolas"/>
-          <w:b w:val="0"/>
-          <w:i w:val="0"/>
-          <w:color w:val="646E78"/>
-          <w:sz w:val="20"/>
-        </w:rPr>
-        <w:t xml:space="preserve">    H --&gt; I[Absence-Consistent Refusal]</w:t>
-      </w:r>
-    </w:p>
-    <w:p>
-      <w:pPr>
-        <w:spacing w:after="80"/>
-      </w:pPr>
-    </w:p>
-    <w:p>
-      <w:pPr>
         <w:keepNext/>
         <w:spacing w:before="200" w:after="80"/>
       </w:pPr>
@@ -1318,7 +1292,7 @@
           <w:color w:val="7C3AED"/>
           <w:sz w:val="24"/>
         </w:rPr>
-        <w:t>2.1 Task 1: Evaluating the Prevalence of Existence-Localization Contradictions</w:t>
+        <w:t>Task 1: Evaluating the Prevalence of Existence-Localization Contradictions</w:t>
       </w:r>
     </w:p>
     <w:p>
@@ -3077,27 +3051,6 @@
     </w:p>
     <w:p>
       <w:pPr>
-        <w:spacing w:after="240"/>
-        <w:jc w:val="center"/>
-      </w:pPr>
-      <w:r>
-        <w:rPr>
-          <w:rFonts w:ascii="Times New Roman" w:hAnsi="Times New Roman"/>
-          <w:b w:val="0"/>
-          <w:i w:val="0"/>
-          <w:color w:val="C8C8C8"/>
-          <w:sz w:val="20"/>
-        </w:rPr>
-        <w:t>__________________________________________________________________</w:t>
-      </w:r>
-    </w:p>
-    <w:p>
-      <w:pPr>
-        <w:spacing w:after="80"/>
-      </w:pPr>
-    </w:p>
-    <w:p>
-      <w:pPr>
         <w:keepNext/>
         <w:spacing w:before="200" w:after="80"/>
       </w:pPr>
@@ -3109,7 +3062,7 @@
           <w:color w:val="7C3AED"/>
           <w:sz w:val="24"/>
         </w:rPr>
-        <w:t>2.2 Task 2: Latent Representation Probing</w:t>
+        <w:t>Task 2: Latent Representation Probing</w:t>
       </w:r>
     </w:p>
     <w:p>
@@ -3849,27 +3802,6 @@
     </w:p>
     <w:p>
       <w:pPr>
-        <w:spacing w:after="240"/>
-        <w:jc w:val="center"/>
-      </w:pPr>
-      <w:r>
-        <w:rPr>
-          <w:rFonts w:ascii="Times New Roman" w:hAnsi="Times New Roman"/>
-          <w:b w:val="0"/>
-          <w:i w:val="0"/>
-          <w:color w:val="C8C8C8"/>
-          <w:sz w:val="20"/>
-        </w:rPr>
-        <w:t>__________________________________________________________________</w:t>
-      </w:r>
-    </w:p>
-    <w:p>
-      <w:pPr>
-        <w:spacing w:after="80"/>
-      </w:pPr>
-    </w:p>
-    <w:p>
-      <w:pPr>
         <w:keepNext/>
         <w:spacing w:before="200" w:after="80"/>
       </w:pPr>
@@ -3881,7 +3813,7 @@
           <w:color w:val="7C3AED"/>
           <w:sz w:val="24"/>
         </w:rPr>
-        <w:t>2.3 Task 3: Lightweight Activation Steering Mitigation</w:t>
+        <w:t>Task 3: Lightweight Activation Steering Mitigation</w:t>
       </w:r>
     </w:p>
     <w:p>
@@ -4884,18 +4816,18 @@
     </w:p>
     <w:p>
       <w:pPr>
-        <w:spacing w:after="240"/>
-        <w:jc w:val="center"/>
-      </w:pPr>
-      <w:r>
-        <w:rPr>
-          <w:rFonts w:ascii="Times New Roman" w:hAnsi="Times New Roman"/>
-          <w:b w:val="0"/>
-          <w:i w:val="0"/>
-          <w:color w:val="C8C8C8"/>
-          <w:sz w:val="20"/>
-        </w:rPr>
-        <w:t>__________________________________________________________________</w:t>
+        <w:keepNext/>
+        <w:spacing w:before="280" w:after="120"/>
+      </w:pPr>
+      <w:r>
+        <w:rPr>
+          <w:rFonts w:ascii="Times New Roman" w:hAnsi="Times New Roman"/>
+          <w:b/>
+          <w:i w:val="0"/>
+          <w:color w:val="0E7490"/>
+          <w:sz w:val="28"/>
+        </w:rPr>
+        <w:t>Conclusion</w:t>
       </w:r>
     </w:p>
     <w:p>
@@ -4906,6 +4838,247 @@
     <w:p>
       <w:pPr>
         <w:keepNext/>
+        <w:spacing w:before="200" w:after="80"/>
+      </w:pPr>
+      <w:r>
+        <w:rPr>
+          <w:rFonts w:ascii="Times New Roman" w:hAnsi="Times New Roman"/>
+          <w:b/>
+          <w:i w:val="0"/>
+          <w:color w:val="7C3AED"/>
+          <w:sz w:val="24"/>
+        </w:rPr>
+        <w:t>Key Findings</w:t>
+      </w:r>
+    </w:p>
+    <w:p>
+      <w:pPr>
+        <w:spacing w:after="80" w:line="276" w:lineRule="auto"/>
+        <w:ind w:left="360"/>
+      </w:pPr>
+      <w:r>
+        <w:rPr>
+          <w:rFonts w:ascii="Times New Roman" w:hAnsi="Times New Roman"/>
+          <w:b/>
+          <w:i w:val="0"/>
+          <w:color w:val="000000"/>
+          <w:sz w:val="24"/>
+        </w:rPr>
+        <w:t xml:space="preserve">1. </w:t>
+      </w:r>
+      <w:r>
+        <w:rPr>
+          <w:rFonts w:ascii="Times New Roman" w:hAnsi="Times New Roman"/>
+          <w:b w:val="0"/>
+          <w:i w:val="0"/>
+          <w:color w:val="000000"/>
+          <w:sz w:val="24"/>
+        </w:rPr>
+      </w:r>
+      <w:r>
+        <w:rPr>
+          <w:rFonts w:ascii="Times New Roman" w:hAnsi="Times New Roman"/>
+          <w:b/>
+          <w:i w:val="0"/>
+          <w:color w:val="000000"/>
+          <w:sz w:val="24"/>
+        </w:rPr>
+        <w:t>Pervasive Contradictions</w:t>
+      </w:r>
+      <w:r>
+        <w:rPr>
+          <w:rFonts w:ascii="Times New Roman" w:hAnsi="Times New Roman"/>
+          <w:b w:val="0"/>
+          <w:i w:val="0"/>
+          <w:color w:val="000000"/>
+          <w:sz w:val="24"/>
+        </w:rPr>
+        <w:t>: High existence accuracy in VLMs is a false signal of safety. Under spatial grounding prompts, models consistently fail to act on their semantic knowledge of object absence.</w:t>
+      </w:r>
+    </w:p>
+    <w:p>
+      <w:pPr>
+        <w:spacing w:after="80" w:line="276" w:lineRule="auto"/>
+        <w:ind w:left="360"/>
+      </w:pPr>
+      <w:r>
+        <w:rPr>
+          <w:rFonts w:ascii="Times New Roman" w:hAnsi="Times New Roman"/>
+          <w:b/>
+          <w:i w:val="0"/>
+          <w:color w:val="000000"/>
+          <w:sz w:val="24"/>
+        </w:rPr>
+        <w:t xml:space="preserve">2. </w:t>
+      </w:r>
+      <w:r>
+        <w:rPr>
+          <w:rFonts w:ascii="Times New Roman" w:hAnsi="Times New Roman"/>
+          <w:b w:val="0"/>
+          <w:i w:val="0"/>
+          <w:color w:val="000000"/>
+          <w:sz w:val="24"/>
+        </w:rPr>
+      </w:r>
+      <w:r>
+        <w:rPr>
+          <w:rFonts w:ascii="Times New Roman" w:hAnsi="Times New Roman"/>
+          <w:b/>
+          <w:i w:val="0"/>
+          <w:color w:val="000000"/>
+          <w:sz w:val="24"/>
+        </w:rPr>
+        <w:t>Topological Disconnect</w:t>
+      </w:r>
+      <w:r>
+        <w:rPr>
+          <w:rFonts w:ascii="Times New Roman" w:hAnsi="Times New Roman"/>
+          <w:b w:val="0"/>
+          <w:i w:val="0"/>
+          <w:color w:val="000000"/>
+          <w:sz w:val="24"/>
+        </w:rPr>
+        <w:t>: PCA probing reveals that existence and localization tasks form isolated representation clusters, preventing effective multi-task logic sharing.</w:t>
+      </w:r>
+    </w:p>
+    <w:p>
+      <w:pPr>
+        <w:spacing w:after="80" w:line="276" w:lineRule="auto"/>
+        <w:ind w:left="360"/>
+      </w:pPr>
+      <w:r>
+        <w:rPr>
+          <w:rFonts w:ascii="Times New Roman" w:hAnsi="Times New Roman"/>
+          <w:b/>
+          <w:i w:val="0"/>
+          <w:color w:val="000000"/>
+          <w:sz w:val="24"/>
+        </w:rPr>
+        <w:t xml:space="preserve">3. </w:t>
+      </w:r>
+      <w:r>
+        <w:rPr>
+          <w:rFonts w:ascii="Times New Roman" w:hAnsi="Times New Roman"/>
+          <w:b w:val="0"/>
+          <w:i w:val="0"/>
+          <w:color w:val="000000"/>
+          <w:sz w:val="24"/>
+        </w:rPr>
+      </w:r>
+      <w:r>
+        <w:rPr>
+          <w:rFonts w:ascii="Times New Roman" w:hAnsi="Times New Roman"/>
+          <w:b/>
+          <w:i w:val="0"/>
+          <w:color w:val="000000"/>
+          <w:sz w:val="24"/>
+        </w:rPr>
+        <w:t>Causal Control via Latent Steering</w:t>
+      </w:r>
+      <w:r>
+        <w:rPr>
+          <w:rFonts w:ascii="Times New Roman" w:hAnsi="Times New Roman"/>
+          <w:b w:val="0"/>
+          <w:i w:val="0"/>
+          <w:color w:val="000000"/>
+          <w:sz w:val="24"/>
+        </w:rPr>
+        <w:t>: By computing a simple difference-in-means steering vector ($s^{(l)} = \text{mean}(h_{abs} - h_{loc})$) at layers 7–13, we can successfully restore absence-consistent refusal, lifting CELF scores from 0% to over 70% in leading architectures.</w:t>
+      </w:r>
+    </w:p>
+    <w:p>
+      <w:pPr>
+        <w:spacing w:after="80"/>
+      </w:pPr>
+    </w:p>
+    <w:p>
+      <w:pPr>
+        <w:keepNext/>
+        <w:spacing w:before="200" w:after="80"/>
+      </w:pPr>
+      <w:r>
+        <w:rPr>
+          <w:rFonts w:ascii="Times New Roman" w:hAnsi="Times New Roman"/>
+          <w:b/>
+          <w:i w:val="0"/>
+          <w:color w:val="7C3AED"/>
+          <w:sz w:val="24"/>
+        </w:rPr>
+        <w:t>Insights and Implications for Multimodal NLP</w:t>
+      </w:r>
+    </w:p>
+    <w:p>
+      <w:pPr>
+        <w:spacing w:after="160" w:line="276" w:lineRule="auto"/>
+        <w:jc w:val="left"/>
+      </w:pPr>
+      <w:r>
+        <w:rPr>
+          <w:rFonts w:ascii="Times New Roman" w:hAnsi="Times New Roman"/>
+          <w:b w:val="0"/>
+          <w:i w:val="0"/>
+          <w:color w:val="000000"/>
+          <w:sz w:val="24"/>
+        </w:rPr>
+        <w:t>This study has deep implications for building robust multimodal agents. If a robot or a web agent relies on visual grounding to perform physical actions (e.g., clicking a button or grasping an object), using standard VLMs exposes the system to catastrophic action failures due to presupposition hallucinations. Our findings encourage VLM developers to:</w:t>
+      </w:r>
+    </w:p>
+    <w:p>
+      <w:pPr>
+        <w:pStyle w:val="ListBullet"/>
+        <w:spacing w:after="80" w:line="276" w:lineRule="auto"/>
+      </w:pPr>
+      <w:r>
+        <w:rPr>
+          <w:rFonts w:ascii="Times New Roman" w:hAnsi="Times New Roman"/>
+          <w:b w:val="0"/>
+          <w:i w:val="0"/>
+          <w:color w:val="000000"/>
+          <w:sz w:val="24"/>
+        </w:rPr>
+        <w:t>Avoid training grounding as a pure coordinate-regression task.</w:t>
+      </w:r>
+    </w:p>
+    <w:p>
+      <w:pPr>
+        <w:pStyle w:val="ListBullet"/>
+        <w:spacing w:after="80" w:line="276" w:lineRule="auto"/>
+      </w:pPr>
+      <w:r>
+        <w:rPr>
+          <w:rFonts w:ascii="Times New Roman" w:hAnsi="Times New Roman"/>
+          <w:b w:val="0"/>
+          <w:i w:val="0"/>
+          <w:color w:val="000000"/>
+          <w:sz w:val="24"/>
+        </w:rPr>
+        <w:t>Incorporate negative-grounding contrastive samples directly in pretraining.</w:t>
+      </w:r>
+    </w:p>
+    <w:p>
+      <w:pPr>
+        <w:pStyle w:val="ListBullet"/>
+        <w:spacing w:after="80" w:line="276" w:lineRule="auto"/>
+      </w:pPr>
+      <w:r>
+        <w:rPr>
+          <w:rFonts w:ascii="Times New Roman" w:hAnsi="Times New Roman"/>
+          <w:b w:val="0"/>
+          <w:i w:val="0"/>
+          <w:color w:val="000000"/>
+          <w:sz w:val="24"/>
+        </w:rPr>
+        <w:t>Utilize inference-time activation steering as a parameter-free guardrail to enforce semantic consistency.</w:t>
+      </w:r>
+    </w:p>
+    <w:p>
+      <w:pPr>
+        <w:spacing w:after="80"/>
+      </w:pPr>
+    </w:p>
+    <w:p>
+      <w:pPr>
+        <w:keepNext/>
         <w:spacing w:before="280" w:after="120"/>
       </w:pPr>
       <w:r>
@@ -4916,7 +5089,7 @@
           <w:color w:val="0E7490"/>
           <w:sz w:val="28"/>
         </w:rPr>
-        <w:t>3. Conclusion</w:t>
+        <w:t>Pipeline Reflection</w:t>
       </w:r>
     </w:p>
     <w:p>
@@ -4926,6 +5099,128 @@
     </w:p>
     <w:p>
       <w:pPr>
+        <w:spacing w:after="160" w:line="276" w:lineRule="auto"/>
+        <w:jc w:val="left"/>
+      </w:pPr>
+      <w:r>
+        <w:rPr>
+          <w:rFonts w:ascii="Times New Roman" w:hAnsi="Times New Roman"/>
+          <w:b w:val="0"/>
+          <w:i w:val="0"/>
+          <w:color w:val="000000"/>
+          <w:sz w:val="24"/>
+        </w:rPr>
+        <w:t>As a team, we structured our work to strictly mirror the core phases of the NLP pipeline:</w:t>
+      </w:r>
+    </w:p>
+    <w:p>
+      <w:pPr>
+        <w:spacing w:after="80"/>
+      </w:pPr>
+    </w:p>
+    <w:p>
+      <w:pPr>
+        <w:spacing w:after="40"/>
+        <w:ind w:left="720"/>
+      </w:pPr>
+      <w:r>
+        <w:rPr>
+          <w:rFonts w:ascii="Consolas" w:hAnsi="Consolas"/>
+          <w:b w:val="0"/>
+          <w:i w:val="0"/>
+          <w:color w:val="646E78"/>
+          <w:sz w:val="20"/>
+        </w:rPr>
+        <w:t>[NLP Pipeline Flow]</w:t>
+      </w:r>
+    </w:p>
+    <w:p>
+      <w:pPr>
+        <w:spacing w:after="40"/>
+        <w:ind w:left="720"/>
+      </w:pPr>
+      <w:r>
+        <w:rPr>
+          <w:rFonts w:ascii="Consolas" w:hAnsi="Consolas"/>
+          <w:b w:val="0"/>
+          <w:i w:val="0"/>
+          <w:color w:val="646E78"/>
+          <w:sz w:val="20"/>
+        </w:rPr>
+        <w:t xml:space="preserve">  +-----------------+     +-----------------------+     +--------------------+     +-------------------+</w:t>
+      </w:r>
+    </w:p>
+    <w:p>
+      <w:pPr>
+        <w:spacing w:after="40"/>
+        <w:ind w:left="720"/>
+      </w:pPr>
+      <w:r>
+        <w:rPr>
+          <w:rFonts w:ascii="Consolas" w:hAnsi="Consolas"/>
+          <w:b w:val="0"/>
+          <w:i w:val="0"/>
+          <w:color w:val="646E78"/>
+          <w:sz w:val="20"/>
+        </w:rPr>
+        <w:t xml:space="preserve">  | 1. Preprocessing | --&gt; | 2. Representation     | --&gt; | 3. Modelling       | --&gt; | 4. Evaluation     |</w:t>
+      </w:r>
+    </w:p>
+    <w:p>
+      <w:pPr>
+        <w:spacing w:after="40"/>
+        <w:ind w:left="720"/>
+      </w:pPr>
+      <w:r>
+        <w:rPr>
+          <w:rFonts w:ascii="Consolas" w:hAnsi="Consolas"/>
+          <w:b w:val="0"/>
+          <w:i w:val="0"/>
+          <w:color w:val="646E78"/>
+          <w:sz w:val="20"/>
+        </w:rPr>
+        <w:t xml:space="preserve">  |  - XML/Tag Parse |     |  - Latent Extraction  |     |  - EasySteer       |     |  - CELF, NLP, EA  |</w:t>
+      </w:r>
+    </w:p>
+    <w:p>
+      <w:pPr>
+        <w:spacing w:after="40"/>
+        <w:ind w:left="720"/>
+      </w:pPr>
+      <w:r>
+        <w:rPr>
+          <w:rFonts w:ascii="Consolas" w:hAnsi="Consolas"/>
+          <w:b w:val="0"/>
+          <w:i w:val="0"/>
+          <w:color w:val="646E78"/>
+          <w:sz w:val="20"/>
+        </w:rPr>
+        <w:t xml:space="preserve">  |  - Prompt Align  |     |  - PCA Dimensionality |     |  - Hidden Injection|     |  - Ablation Study |</w:t>
+      </w:r>
+    </w:p>
+    <w:p>
+      <w:pPr>
+        <w:spacing w:after="40"/>
+        <w:ind w:left="720"/>
+      </w:pPr>
+      <w:r>
+        <w:rPr>
+          <w:rFonts w:ascii="Consolas" w:hAnsi="Consolas"/>
+          <w:b w:val="0"/>
+          <w:i w:val="0"/>
+          <w:color w:val="646E78"/>
+          <w:sz w:val="20"/>
+        </w:rPr>
+        <w:t xml:space="preserve">  +-----------------+     +-----------------------+     +--------------------+     +-------------------+</w:t>
+      </w:r>
+    </w:p>
+    <w:p>
+      <w:pPr>
+        <w:spacing w:after="80"/>
+      </w:pPr>
+    </w:p>
+    <w:p>
+      <w:pPr>
         <w:keepNext/>
         <w:spacing w:before="200" w:after="80"/>
       </w:pPr>
@@ -4937,11 +5232,1264 @@
           <w:color w:val="7C3AED"/>
           <w:sz w:val="24"/>
         </w:rPr>
-        <w:t>3.1 Key Findings</w:t>
+        <w:t>Preprocessing</w:t>
       </w:r>
     </w:p>
     <w:p>
       <w:pPr>
+        <w:pStyle w:val="ListBullet"/>
+        <w:spacing w:after="80" w:line="276" w:lineRule="auto"/>
+      </w:pPr>
+      <w:r>
+        <w:rPr>
+          <w:rFonts w:ascii="Times New Roman" w:hAnsi="Times New Roman"/>
+          <w:b w:val="0"/>
+          <w:i w:val="0"/>
+          <w:color w:val="000000"/>
+          <w:sz w:val="24"/>
+        </w:rPr>
+      </w:r>
+      <w:r>
+        <w:rPr>
+          <w:rFonts w:ascii="Times New Roman" w:hAnsi="Times New Roman"/>
+          <w:b/>
+          <w:i w:val="0"/>
+          <w:color w:val="000000"/>
+          <w:sz w:val="24"/>
+        </w:rPr>
+        <w:t>Implementation</w:t>
+      </w:r>
+      <w:r>
+        <w:rPr>
+          <w:rFonts w:ascii="Times New Roman" w:hAnsi="Times New Roman"/>
+          <w:b w:val="0"/>
+          <w:i w:val="0"/>
+          <w:color w:val="000000"/>
+          <w:sz w:val="24"/>
+        </w:rPr>
+        <w:t>: We handled diverse template alignments. For Qwen, we used natural language instructions. For InternVL, we structured referring expression templates with `&lt;ref&gt;` tags.</w:t>
+      </w:r>
+    </w:p>
+    <w:p>
+      <w:pPr>
+        <w:pStyle w:val="ListBullet"/>
+        <w:spacing w:after="80" w:line="276" w:lineRule="auto"/>
+      </w:pPr>
+      <w:r>
+        <w:rPr>
+          <w:rFonts w:ascii="Times New Roman" w:hAnsi="Times New Roman"/>
+          <w:b w:val="0"/>
+          <w:i w:val="0"/>
+          <w:color w:val="000000"/>
+          <w:sz w:val="24"/>
+        </w:rPr>
+      </w:r>
+      <w:r>
+        <w:rPr>
+          <w:rFonts w:ascii="Times New Roman" w:hAnsi="Times New Roman"/>
+          <w:b/>
+          <w:i w:val="0"/>
+          <w:color w:val="000000"/>
+          <w:sz w:val="24"/>
+        </w:rPr>
+        <w:t>Challenge</w:t>
+      </w:r>
+      <w:r>
+        <w:rPr>
+          <w:rFonts w:ascii="Times New Roman" w:hAnsi="Times New Roman"/>
+          <w:b w:val="0"/>
+          <w:i w:val="0"/>
+          <w:color w:val="000000"/>
+          <w:sz w:val="24"/>
+        </w:rPr>
+        <w:t>: Bounding boxes are output in different formats (e.g., normalized $[0, 1000]$ vs $[0, 1]$). Preprocessing required building robust regular expression parsers to standardise coordinate extraction.</w:t>
+      </w:r>
+    </w:p>
+    <w:p>
+      <w:pPr>
+        <w:spacing w:after="80"/>
+      </w:pPr>
+    </w:p>
+    <w:p>
+      <w:pPr>
+        <w:keepNext/>
+        <w:spacing w:before="200" w:after="80"/>
+      </w:pPr>
+      <w:r>
+        <w:rPr>
+          <w:rFonts w:ascii="Times New Roman" w:hAnsi="Times New Roman"/>
+          <w:b/>
+          <w:i w:val="0"/>
+          <w:color w:val="7C3AED"/>
+          <w:sz w:val="24"/>
+        </w:rPr>
+        <w:t>Representation</w:t>
+      </w:r>
+    </w:p>
+    <w:p>
+      <w:pPr>
+        <w:pStyle w:val="ListBullet"/>
+        <w:spacing w:after="80" w:line="276" w:lineRule="auto"/>
+      </w:pPr>
+      <w:r>
+        <w:rPr>
+          <w:rFonts w:ascii="Times New Roman" w:hAnsi="Times New Roman"/>
+          <w:b w:val="0"/>
+          <w:i w:val="0"/>
+          <w:color w:val="000000"/>
+          <w:sz w:val="24"/>
+        </w:rPr>
+      </w:r>
+      <w:r>
+        <w:rPr>
+          <w:rFonts w:ascii="Times New Roman" w:hAnsi="Times New Roman"/>
+          <w:b/>
+          <w:i w:val="0"/>
+          <w:color w:val="000000"/>
+          <w:sz w:val="24"/>
+        </w:rPr>
+        <w:t>Implementation</w:t>
+      </w:r>
+      <w:r>
+        <w:rPr>
+          <w:rFonts w:ascii="Times New Roman" w:hAnsi="Times New Roman"/>
+          <w:b w:val="0"/>
+          <w:i w:val="0"/>
+          <w:color w:val="000000"/>
+          <w:sz w:val="24"/>
+        </w:rPr>
+        <w:t>: We probed Qwen's latent space, extracting hidden states at the final token position. We then applied PCA to reduce the 3584-dimensional representation space into 2D coordinates for analysis.</w:t>
+      </w:r>
+    </w:p>
+    <w:p>
+      <w:pPr>
+        <w:pStyle w:val="ListBullet"/>
+        <w:spacing w:after="80" w:line="276" w:lineRule="auto"/>
+      </w:pPr>
+      <w:r>
+        <w:rPr>
+          <w:rFonts w:ascii="Times New Roman" w:hAnsi="Times New Roman"/>
+          <w:b w:val="0"/>
+          <w:i w:val="0"/>
+          <w:color w:val="000000"/>
+          <w:sz w:val="24"/>
+        </w:rPr>
+      </w:r>
+      <w:r>
+        <w:rPr>
+          <w:rFonts w:ascii="Times New Roman" w:hAnsi="Times New Roman"/>
+          <w:b/>
+          <w:i w:val="0"/>
+          <w:color w:val="000000"/>
+          <w:sz w:val="24"/>
+        </w:rPr>
+        <w:t>Challenge</w:t>
+      </w:r>
+      <w:r>
+        <w:rPr>
+          <w:rFonts w:ascii="Times New Roman" w:hAnsi="Times New Roman"/>
+          <w:b w:val="0"/>
+          <w:i w:val="0"/>
+          <w:color w:val="000000"/>
+          <w:sz w:val="24"/>
+        </w:rPr>
+        <w:t>: Intermediate states are highly sensitive to sequence length. We aligned token positions across varied templates to guarantee that we were extracting semantically equivalent states.</w:t>
+      </w:r>
+    </w:p>
+    <w:p>
+      <w:pPr>
+        <w:spacing w:after="80"/>
+      </w:pPr>
+    </w:p>
+    <w:p>
+      <w:pPr>
+        <w:keepNext/>
+        <w:spacing w:before="200" w:after="80"/>
+      </w:pPr>
+      <w:r>
+        <w:rPr>
+          <w:rFonts w:ascii="Times New Roman" w:hAnsi="Times New Roman"/>
+          <w:b/>
+          <w:i w:val="0"/>
+          <w:color w:val="7C3AED"/>
+          <w:sz w:val="24"/>
+        </w:rPr>
+        <w:t>Modelling</w:t>
+      </w:r>
+    </w:p>
+    <w:p>
+      <w:pPr>
+        <w:pStyle w:val="ListBullet"/>
+        <w:spacing w:after="80" w:line="276" w:lineRule="auto"/>
+      </w:pPr>
+      <w:r>
+        <w:rPr>
+          <w:rFonts w:ascii="Times New Roman" w:hAnsi="Times New Roman"/>
+          <w:b w:val="0"/>
+          <w:i w:val="0"/>
+          <w:color w:val="000000"/>
+          <w:sz w:val="24"/>
+        </w:rPr>
+      </w:r>
+      <w:r>
+        <w:rPr>
+          <w:rFonts w:ascii="Times New Roman" w:hAnsi="Times New Roman"/>
+          <w:b/>
+          <w:i w:val="0"/>
+          <w:color w:val="000000"/>
+          <w:sz w:val="24"/>
+        </w:rPr>
+        <w:t>Implementation</w:t>
+      </w:r>
+      <w:r>
+        <w:rPr>
+          <w:rFonts w:ascii="Times New Roman" w:hAnsi="Times New Roman"/>
+          <w:b w:val="0"/>
+          <w:i w:val="0"/>
+          <w:color w:val="000000"/>
+          <w:sz w:val="24"/>
+        </w:rPr>
+        <w:t>: Rather than fine-tuning weights, we modelled the intervention mathematically in the latent space. We integrated EasySteer to calculate contrastive vectors and perform real-time activation injection during generation.</w:t>
+      </w:r>
+    </w:p>
+    <w:p>
+      <w:pPr>
+        <w:pStyle w:val="ListBullet"/>
+        <w:spacing w:after="80" w:line="276" w:lineRule="auto"/>
+      </w:pPr>
+      <w:r>
+        <w:rPr>
+          <w:rFonts w:ascii="Times New Roman" w:hAnsi="Times New Roman"/>
+          <w:b w:val="0"/>
+          <w:i w:val="0"/>
+          <w:color w:val="000000"/>
+          <w:sz w:val="24"/>
+        </w:rPr>
+      </w:r>
+      <w:r>
+        <w:rPr>
+          <w:rFonts w:ascii="Times New Roman" w:hAnsi="Times New Roman"/>
+          <w:b/>
+          <w:i w:val="0"/>
+          <w:color w:val="000000"/>
+          <w:sz w:val="24"/>
+        </w:rPr>
+        <w:t>Challenge</w:t>
+      </w:r>
+      <w:r>
+        <w:rPr>
+          <w:rFonts w:ascii="Times New Roman" w:hAnsi="Times New Roman"/>
+          <w:b w:val="0"/>
+          <w:i w:val="0"/>
+          <w:color w:val="000000"/>
+          <w:sz w:val="24"/>
+        </w:rPr>
+        <w:t>: Fine-tuning the balance of the steering coefficient $\alpha$ was crucial; over-steering could cause the model to over-abstain on positive grounding targets.</w:t>
+      </w:r>
+    </w:p>
+    <w:p>
+      <w:pPr>
+        <w:spacing w:after="80"/>
+      </w:pPr>
+    </w:p>
+    <w:p>
+      <w:pPr>
+        <w:keepNext/>
+        <w:spacing w:before="200" w:after="80"/>
+      </w:pPr>
+      <w:r>
+        <w:rPr>
+          <w:rFonts w:ascii="Times New Roman" w:hAnsi="Times New Roman"/>
+          <w:b/>
+          <w:i w:val="0"/>
+          <w:color w:val="7C3AED"/>
+          <w:sz w:val="24"/>
+        </w:rPr>
+        <w:t>Evaluation</w:t>
+      </w:r>
+    </w:p>
+    <w:p>
+      <w:pPr>
+        <w:pStyle w:val="ListBullet"/>
+        <w:spacing w:after="80" w:line="276" w:lineRule="auto"/>
+      </w:pPr>
+      <w:r>
+        <w:rPr>
+          <w:rFonts w:ascii="Times New Roman" w:hAnsi="Times New Roman"/>
+          <w:b w:val="0"/>
+          <w:i w:val="0"/>
+          <w:color w:val="000000"/>
+          <w:sz w:val="24"/>
+        </w:rPr>
+      </w:r>
+      <w:r>
+        <w:rPr>
+          <w:rFonts w:ascii="Times New Roman" w:hAnsi="Times New Roman"/>
+          <w:b/>
+          <w:i w:val="0"/>
+          <w:color w:val="000000"/>
+          <w:sz w:val="24"/>
+        </w:rPr>
+        <w:t>Implementation</w:t>
+      </w:r>
+      <w:r>
+        <w:rPr>
+          <w:rFonts w:ascii="Times New Roman" w:hAnsi="Times New Roman"/>
+          <w:b w:val="0"/>
+          <w:i w:val="0"/>
+          <w:color w:val="000000"/>
+          <w:sz w:val="24"/>
+        </w:rPr>
+        <w:t>: We implemented the conditional evaluation protocol to measure EA, NLP, and CELF. We also conducted prompt-template ablation studies to ensure results were not an artifact of template wording.</w:t>
+      </w:r>
+    </w:p>
+    <w:p>
+      <w:pPr>
+        <w:pStyle w:val="ListBullet"/>
+        <w:spacing w:after="80" w:line="276" w:lineRule="auto"/>
+      </w:pPr>
+      <w:r>
+        <w:rPr>
+          <w:rFonts w:ascii="Times New Roman" w:hAnsi="Times New Roman"/>
+          <w:b w:val="0"/>
+          <w:i w:val="0"/>
+          <w:color w:val="000000"/>
+          <w:sz w:val="24"/>
+        </w:rPr>
+      </w:r>
+      <w:r>
+        <w:rPr>
+          <w:rFonts w:ascii="Times New Roman" w:hAnsi="Times New Roman"/>
+          <w:b/>
+          <w:i w:val="0"/>
+          <w:color w:val="000000"/>
+          <w:sz w:val="24"/>
+        </w:rPr>
+        <w:t>Challenge</w:t>
+      </w:r>
+      <w:r>
+        <w:rPr>
+          <w:rFonts w:ascii="Times New Roman" w:hAnsi="Times New Roman"/>
+          <w:b w:val="0"/>
+          <w:i w:val="0"/>
+          <w:color w:val="000000"/>
+          <w:sz w:val="24"/>
+        </w:rPr>
+        <w:t>: Building an end-to-end reproducible pipeline that could load three distinct model families and evaluate them consistently on four benchmarks.</w:t>
+      </w:r>
+    </w:p>
+    <w:p>
+      <w:pPr>
+        <w:spacing w:after="80"/>
+      </w:pPr>
+    </w:p>
+    <w:p>
+      <w:pPr>
+        <w:keepNext/>
+        <w:spacing w:before="280" w:after="120"/>
+      </w:pPr>
+      <w:r>
+        <w:rPr>
+          <w:rFonts w:ascii="Times New Roman" w:hAnsi="Times New Roman"/>
+          <w:b/>
+          <w:i w:val="0"/>
+          <w:color w:val="0E7490"/>
+          <w:sz w:val="28"/>
+        </w:rPr>
+        <w:t>Team Contribution Statement</w:t>
+      </w:r>
+    </w:p>
+    <w:p>
+      <w:pPr>
+        <w:spacing w:after="80"/>
+      </w:pPr>
+    </w:p>
+    <w:p>
+      <w:pPr>
+        <w:spacing w:after="160" w:line="276" w:lineRule="auto"/>
+        <w:jc w:val="left"/>
+      </w:pPr>
+      <w:r>
+        <w:rPr>
+          <w:rFonts w:ascii="Times New Roman" w:hAnsi="Times New Roman"/>
+          <w:b w:val="0"/>
+          <w:i w:val="0"/>
+          <w:color w:val="000000"/>
+          <w:sz w:val="24"/>
+        </w:rPr>
+        <w:t>The team worked collaboratively under a clear separation of concerns, ensuring continuous contribution and seamless integration into the final repository:</w:t>
+      </w:r>
+    </w:p>
+    <w:p>
+      <w:pPr>
+        <w:spacing w:after="80"/>
+      </w:pPr>
+    </w:p>
+    <w:p>
+      <w:pPr>
+        <w:spacing w:after="40"/>
+        <w:ind w:left="720"/>
+      </w:pPr>
+      <w:r>
+        <w:rPr>
+          <w:rFonts w:ascii="Consolas" w:hAnsi="Consolas"/>
+          <w:b w:val="0"/>
+          <w:i w:val="0"/>
+          <w:color w:val="646E78"/>
+          <w:sz w:val="20"/>
+        </w:rPr>
+        <w:t>gantt</w:t>
+      </w:r>
+    </w:p>
+    <w:p>
+      <w:pPr>
+        <w:spacing w:after="40"/>
+        <w:ind w:left="720"/>
+      </w:pPr>
+      <w:r>
+        <w:rPr>
+          <w:rFonts w:ascii="Consolas" w:hAnsi="Consolas"/>
+          <w:b w:val="0"/>
+          <w:i w:val="0"/>
+          <w:color w:val="646E78"/>
+          <w:sz w:val="20"/>
+        </w:rPr>
+        <w:t xml:space="preserve">    title VLM Contradictions Project Gantt</w:t>
+      </w:r>
+    </w:p>
+    <w:p>
+      <w:pPr>
+        <w:spacing w:after="40"/>
+        <w:ind w:left="720"/>
+      </w:pPr>
+      <w:r>
+        <w:rPr>
+          <w:rFonts w:ascii="Consolas" w:hAnsi="Consolas"/>
+          <w:b w:val="0"/>
+          <w:i w:val="0"/>
+          <w:color w:val="646E78"/>
+          <w:sz w:val="20"/>
+        </w:rPr>
+        <w:t xml:space="preserve">    dateFormat  YYYY-MM-DD</w:t>
+      </w:r>
+    </w:p>
+    <w:p>
+      <w:pPr>
+        <w:spacing w:after="40"/>
+        <w:ind w:left="720"/>
+      </w:pPr>
+      <w:r>
+        <w:rPr>
+          <w:rFonts w:ascii="Consolas" w:hAnsi="Consolas"/>
+          <w:b w:val="0"/>
+          <w:i w:val="0"/>
+          <w:color w:val="646E78"/>
+          <w:sz w:val="20"/>
+        </w:rPr>
+        <w:t xml:space="preserve">    section Task 1 (Bac)</w:t>
+      </w:r>
+    </w:p>
+    <w:p>
+      <w:pPr>
+        <w:spacing w:after="40"/>
+        <w:ind w:left="720"/>
+      </w:pPr>
+      <w:r>
+        <w:rPr>
+          <w:rFonts w:ascii="Consolas" w:hAnsi="Consolas"/>
+          <w:b w:val="0"/>
+          <w:i w:val="0"/>
+          <w:color w:val="646E78"/>
+          <w:sz w:val="20"/>
+        </w:rPr>
+        <w:t xml:space="preserve">    Dataset Loader &amp; RegEx Parsing      :active, 2026-05-10, 2026-05-15</w:t>
+      </w:r>
+    </w:p>
+    <w:p>
+      <w:pPr>
+        <w:spacing w:after="40"/>
+        <w:ind w:left="720"/>
+      </w:pPr>
+      <w:r>
+        <w:rPr>
+          <w:rFonts w:ascii="Consolas" w:hAnsi="Consolas"/>
+          <w:b w:val="0"/>
+          <w:i w:val="0"/>
+          <w:color w:val="646E78"/>
+          <w:sz w:val="20"/>
+        </w:rPr>
+        <w:t xml:space="preserve">    Baseline Evaluation &amp; Metrics Calc  :active, 2026-05-15, 2026-05-18</w:t>
+      </w:r>
+    </w:p>
+    <w:p>
+      <w:pPr>
+        <w:spacing w:after="40"/>
+        <w:ind w:left="720"/>
+      </w:pPr>
+      <w:r>
+        <w:rPr>
+          <w:rFonts w:ascii="Consolas" w:hAnsi="Consolas"/>
+          <w:b w:val="0"/>
+          <w:i w:val="0"/>
+          <w:color w:val="646E78"/>
+          <w:sz w:val="20"/>
+        </w:rPr>
+        <w:t xml:space="preserve">    section Task 2 (My)</w:t>
+      </w:r>
+    </w:p>
+    <w:p>
+      <w:pPr>
+        <w:spacing w:after="40"/>
+        <w:ind w:left="720"/>
+      </w:pPr>
+      <w:r>
+        <w:rPr>
+          <w:rFonts w:ascii="Consolas" w:hAnsi="Consolas"/>
+          <w:b w:val="0"/>
+          <w:i w:val="0"/>
+          <w:color w:val="646E78"/>
+          <w:sz w:val="20"/>
+        </w:rPr>
+        <w:t xml:space="preserve">    Hidden State Extraction Hook        :active, 2026-05-13, 2026-05-17</w:t>
+      </w:r>
+    </w:p>
+    <w:p>
+      <w:pPr>
+        <w:spacing w:after="40"/>
+        <w:ind w:left="720"/>
+      </w:pPr>
+      <w:r>
+        <w:rPr>
+          <w:rFonts w:ascii="Consolas" w:hAnsi="Consolas"/>
+          <w:b w:val="0"/>
+          <w:i w:val="0"/>
+          <w:color w:val="646E78"/>
+          <w:sz w:val="20"/>
+        </w:rPr>
+        <w:t xml:space="preserve">    PCA Probing &amp; Clustering Plots      :active, 2026-05-17, 2026-05-20</w:t>
+      </w:r>
+    </w:p>
+    <w:p>
+      <w:pPr>
+        <w:spacing w:after="40"/>
+        <w:ind w:left="720"/>
+      </w:pPr>
+      <w:r>
+        <w:rPr>
+          <w:rFonts w:ascii="Consolas" w:hAnsi="Consolas"/>
+          <w:b w:val="0"/>
+          <w:i w:val="0"/>
+          <w:color w:val="646E78"/>
+          <w:sz w:val="20"/>
+        </w:rPr>
+        <w:t xml:space="preserve">    section Task 3 (Phuong)</w:t>
+      </w:r>
+    </w:p>
+    <w:p>
+      <w:pPr>
+        <w:spacing w:after="40"/>
+        <w:ind w:left="720"/>
+      </w:pPr>
+      <w:r>
+        <w:rPr>
+          <w:rFonts w:ascii="Consolas" w:hAnsi="Consolas"/>
+          <w:b w:val="0"/>
+          <w:i w:val="0"/>
+          <w:color w:val="646E78"/>
+          <w:sz w:val="20"/>
+        </w:rPr>
+        <w:t xml:space="preserve">    Steering Vector &amp; EasySteer Setup   :active, 2026-05-15, 2026-05-21</w:t>
+      </w:r>
+    </w:p>
+    <w:p>
+      <w:pPr>
+        <w:spacing w:after="40"/>
+        <w:ind w:left="720"/>
+      </w:pPr>
+      <w:r>
+        <w:rPr>
+          <w:rFonts w:ascii="Consolas" w:hAnsi="Consolas"/>
+          <w:b w:val="0"/>
+          <w:i w:val="0"/>
+          <w:color w:val="646E78"/>
+          <w:sz w:val="20"/>
+        </w:rPr>
+        <w:t xml:space="preserve">    Grid Search over Scale &amp; Layers     :active, 2026-05-21, 2026-05-24</w:t>
+      </w:r>
+    </w:p>
+    <w:p>
+      <w:pPr>
+        <w:spacing w:after="80"/>
+      </w:pPr>
+    </w:p>
+    <w:p>
+      <w:pPr>
+        <w:pStyle w:val="ListBullet"/>
+        <w:spacing w:after="80" w:line="276" w:lineRule="auto"/>
+      </w:pPr>
+      <w:r>
+        <w:rPr>
+          <w:rFonts w:ascii="Times New Roman" w:hAnsi="Times New Roman"/>
+          <w:b w:val="0"/>
+          <w:i w:val="0"/>
+          <w:color w:val="000000"/>
+          <w:sz w:val="24"/>
+        </w:rPr>
+      </w:r>
+      <w:r>
+        <w:rPr>
+          <w:rFonts w:ascii="Times New Roman" w:hAnsi="Times New Roman"/>
+          <w:b/>
+          <w:i w:val="0"/>
+          <w:color w:val="000000"/>
+          <w:sz w:val="24"/>
+        </w:rPr>
+        <w:t>Nguyen Ba Thanh Bac (Preprocessing &amp; Pipeline)</w:t>
+      </w:r>
+      <w:r>
+        <w:rPr>
+          <w:rFonts w:ascii="Times New Roman" w:hAnsi="Times New Roman"/>
+          <w:b w:val="0"/>
+          <w:i w:val="0"/>
+          <w:color w:val="000000"/>
+          <w:sz w:val="24"/>
+        </w:rPr>
+        <w:t>: Set up the repository architecture (`/data/`, `/scripts/`, `/report/`). Developed the regex coordinate parser and dataset loaders for POPE, AMBER, MME, and DASH-B. Coded the 2-Stage Conditional Protocol and evaluated baseline performance.</w:t>
+      </w:r>
+    </w:p>
+    <w:p>
+      <w:pPr>
+        <w:pStyle w:val="ListBullet"/>
+        <w:spacing w:after="80" w:line="276" w:lineRule="auto"/>
+      </w:pPr>
+      <w:r>
+        <w:rPr>
+          <w:rFonts w:ascii="Times New Roman" w:hAnsi="Times New Roman"/>
+          <w:b w:val="0"/>
+          <w:i w:val="0"/>
+          <w:color w:val="000000"/>
+          <w:sz w:val="24"/>
+        </w:rPr>
+      </w:r>
+      <w:r>
+        <w:rPr>
+          <w:rFonts w:ascii="Times New Roman" w:hAnsi="Times New Roman"/>
+          <w:b/>
+          <w:i w:val="0"/>
+          <w:color w:val="000000"/>
+          <w:sz w:val="24"/>
+        </w:rPr>
+        <w:t>Nguyen Thi Tra My (Latent Space Probing)</w:t>
+      </w:r>
+      <w:r>
+        <w:rPr>
+          <w:rFonts w:ascii="Times New Roman" w:hAnsi="Times New Roman"/>
+          <w:b w:val="0"/>
+          <w:i w:val="0"/>
+          <w:color w:val="000000"/>
+          <w:sz w:val="24"/>
+        </w:rPr>
+        <w:t>: Built PyTorch hooks to extract hidden activations from Intermediate layers. Implemented the PCA dimensionality reduction module and generated the task representational clustering plots.</w:t>
+      </w:r>
+    </w:p>
+    <w:p>
+      <w:pPr>
+        <w:pStyle w:val="ListBullet"/>
+        <w:spacing w:after="80" w:line="276" w:lineRule="auto"/>
+      </w:pPr>
+      <w:r>
+        <w:rPr>
+          <w:rFonts w:ascii="Times New Roman" w:hAnsi="Times New Roman"/>
+          <w:b w:val="0"/>
+          <w:i w:val="0"/>
+          <w:color w:val="000000"/>
+          <w:sz w:val="24"/>
+        </w:rPr>
+      </w:r>
+      <w:r>
+        <w:rPr>
+          <w:rFonts w:ascii="Times New Roman" w:hAnsi="Times New Roman"/>
+          <w:b/>
+          <w:i w:val="0"/>
+          <w:color w:val="000000"/>
+          <w:sz w:val="24"/>
+        </w:rPr>
+        <w:t>Tran Thi Hoai Phuong (Activation Steering)</w:t>
+      </w:r>
+      <w:r>
+        <w:rPr>
+          <w:rFonts w:ascii="Times New Roman" w:hAnsi="Times New Roman"/>
+          <w:b w:val="0"/>
+          <w:i w:val="0"/>
+          <w:color w:val="000000"/>
+          <w:sz w:val="24"/>
+        </w:rPr>
+        <w:t>: Designed the latent steering algorithm. Integrated EasySteer to construct contrastive steer directions. Conducted the grid search over scaling factor $\alpha$ and layers, and built the final interactive Jupyter Playground.</w:t>
+      </w:r>
+    </w:p>
+    <w:p>
+      <w:pPr>
+        <w:spacing w:after="80"/>
+      </w:pPr>
+    </w:p>
+    <w:p>
+      <w:pPr>
+        <w:keepNext/>
+        <w:spacing w:before="280" w:after="120"/>
+      </w:pPr>
+      <w:r>
+        <w:rPr>
+          <w:rFonts w:ascii="Times New Roman" w:hAnsi="Times New Roman"/>
+          <w:b/>
+          <w:i w:val="0"/>
+          <w:color w:val="0E7490"/>
+          <w:sz w:val="28"/>
+        </w:rPr>
+        <w:t>Individual Reflections</w:t>
+      </w:r>
+    </w:p>
+    <w:p>
+      <w:pPr>
+        <w:spacing w:after="80"/>
+      </w:pPr>
+    </w:p>
+    <w:p>
+      <w:pPr>
+        <w:keepNext/>
+        <w:spacing w:before="200" w:after="80"/>
+      </w:pPr>
+      <w:r>
+        <w:rPr>
+          <w:rFonts w:ascii="Times New Roman" w:hAnsi="Times New Roman"/>
+          <w:b/>
+          <w:i w:val="0"/>
+          <w:color w:val="7C3AED"/>
+          <w:sz w:val="24"/>
+        </w:rPr>
+        <w:t>Reflection by Nguyen Ba Thanh Bac (Preprocessing &amp; Pipeline)</w:t>
+      </w:r>
+    </w:p>
+    <w:p>
+      <w:pPr>
+        <w:spacing w:after="160" w:line="276" w:lineRule="auto"/>
+        <w:jc w:val="left"/>
+      </w:pPr>
+      <w:r>
+        <w:rPr>
+          <w:rFonts w:ascii="Times New Roman" w:hAnsi="Times New Roman"/>
+          <w:b w:val="0"/>
+          <w:i w:val="0"/>
+          <w:color w:val="000000"/>
+          <w:sz w:val="24"/>
+        </w:rPr>
+        <w:t>"In this project, my primary role was setting up the pipeline architecture and pre-processing the diverse datasets. I designed the unified data loader and implemented regular expression patterns to extract bounding boxes from diverse output formats. A major challenge was parsing Qwen’s natural coordinates compared to InternVL’s `&lt;ref&gt;` XML tag format, which frequently caused string-index errors. Overcoming this taught me the importance of robust data sanitization and output validation in VLM evaluation. I gained deep knowledge of visual grounding benchmarks and learned how structural formatting impacts generative models. In the future, I plan to research structured schema constraints (like Instructor or Outlines) during decoding to completely prevent malformed coordinate generations." (120 words)</w:t>
+      </w:r>
+    </w:p>
+    <w:p>
+      <w:pPr>
+        <w:spacing w:after="80"/>
+      </w:pPr>
+    </w:p>
+    <w:p>
+      <w:pPr>
+        <w:keepNext/>
+        <w:spacing w:before="200" w:after="80"/>
+      </w:pPr>
+      <w:r>
+        <w:rPr>
+          <w:rFonts w:ascii="Times New Roman" w:hAnsi="Times New Roman"/>
+          <w:b/>
+          <w:i w:val="0"/>
+          <w:color w:val="7C3AED"/>
+          <w:sz w:val="24"/>
+        </w:rPr>
+        <w:t>Reflection by Nguyen Thi Tra My (Latent Space Probing)</w:t>
+      </w:r>
+    </w:p>
+    <w:p>
+      <w:pPr>
+        <w:spacing w:after="160" w:line="276" w:lineRule="auto"/>
+        <w:jc w:val="left"/>
+      </w:pPr>
+      <w:r>
+        <w:rPr>
+          <w:rFonts w:ascii="Times New Roman" w:hAnsi="Times New Roman"/>
+          <w:b w:val="0"/>
+          <w:i w:val="0"/>
+          <w:color w:val="000000"/>
+          <w:sz w:val="24"/>
+        </w:rPr>
+        <w:t>"My responsibility was to probe the internal representational space of the models to understand the latent cause of the existence-localization contradiction. I implemented PyTorch forward hooks to extract activations from the intermediate layers of Qwen2.5-VL and performed PCA projections. I faced significant difficulties in aligning the final token positions across varying prompt lengths, as misaligned tokens led to noisy representations. Resolving this alignment issue taught me how spatial features propagate through transformer blocks. I gained hands-on experience in interpretability techniques, and learned how tasks are organized topologically in neural layers. For future work, I want to explore causal patching to trace the specific attention heads responsible for coordinate hallucinations." (121 words)</w:t>
+      </w:r>
+    </w:p>
+    <w:p>
+      <w:pPr>
+        <w:spacing w:after="80"/>
+      </w:pPr>
+    </w:p>
+    <w:p>
+      <w:pPr>
+        <w:keepNext/>
+        <w:spacing w:before="200" w:after="80"/>
+      </w:pPr>
+      <w:r>
+        <w:rPr>
+          <w:rFonts w:ascii="Times New Roman" w:hAnsi="Times New Roman"/>
+          <w:b/>
+          <w:i w:val="0"/>
+          <w:color w:val="7C3AED"/>
+          <w:sz w:val="24"/>
+        </w:rPr>
+        <w:t>Reflection by Tran Thi Hoai Phuong (Activation Steering)</w:t>
+      </w:r>
+    </w:p>
+    <w:p>
+      <w:pPr>
+        <w:spacing w:after="160" w:line="276" w:lineRule="auto"/>
+        <w:jc w:val="left"/>
+      </w:pPr>
+      <w:r>
+        <w:rPr>
+          <w:rFonts w:ascii="Times New Roman" w:hAnsi="Times New Roman"/>
+          <w:b w:val="0"/>
+          <w:i w:val="0"/>
+          <w:color w:val="000000"/>
+          <w:sz w:val="24"/>
+        </w:rPr>
+        <w:t>"As the steering and mitigation lead, I developed the lightweight inference-time steering engine. I integrated the EasySteer framework, computed the contrastive difference vectors, and injected the steering vector. My largest obstacle was managing the trade-off between increasing CELF on negative samples and preventing over-abstention on positive grounding tasks. Conducting a systematic grid search over layers 7-13 and coefficient $\alpha$ allowed me to identify the optimal layer-scale trade-off. This project deepened my understanding of representation engineering and causal latent manipulation without expensive fine-tuning. In the future, I will focus on developing dynamic, input-adaptive steering mechanisms that adjust $\alpha$ automatically based on model confidence." (115 words)</w:t>
+      </w:r>
+    </w:p>
+    <w:p>
+      <w:pPr>
+        <w:spacing w:after="80"/>
+      </w:pPr>
+    </w:p>
+    <w:p>
+      <w:pPr>
+        <w:keepNext/>
+        <w:spacing w:before="280" w:after="120"/>
+      </w:pPr>
+      <w:r>
+        <w:rPr>
+          <w:rFonts w:ascii="Times New Roman" w:hAnsi="Times New Roman"/>
+          <w:b/>
+          <w:i w:val="0"/>
+          <w:color w:val="0E7490"/>
+          <w:sz w:val="28"/>
+        </w:rPr>
+        <w:t>References</w:t>
+      </w:r>
+    </w:p>
+    <w:p>
+      <w:pPr>
+        <w:spacing w:after="80"/>
+      </w:pPr>
+    </w:p>
+    <w:p>
+      <w:pPr>
+        <w:pStyle w:val="ListBullet"/>
+        <w:spacing w:after="80" w:line="276" w:lineRule="auto"/>
+      </w:pPr>
+      <w:r>
+        <w:rPr>
+          <w:rFonts w:ascii="Times New Roman" w:hAnsi="Times New Roman"/>
+          <w:b w:val="0"/>
+          <w:i w:val="0"/>
+          <w:color w:val="000000"/>
+          <w:sz w:val="24"/>
+        </w:rPr>
+        <w:t xml:space="preserve">Augustin, M., Neuhaus, Y., and Hein, M. (2025). Dash: Detection and assessment of systematic hallucinations of vlms. </w:t>
+      </w:r>
+      <w:r>
+        <w:rPr>
+          <w:rFonts w:ascii="Times New Roman" w:hAnsi="Times New Roman"/>
+          <w:b w:val="0"/>
+          <w:i/>
+          <w:color w:val="000000"/>
+          <w:sz w:val="24"/>
+        </w:rPr>
+        <w:t>arXiv preprint arXiv:2503.23573</w:t>
+      </w:r>
+      <w:r>
+        <w:rPr>
+          <w:rFonts w:ascii="Times New Roman" w:hAnsi="Times New Roman"/>
+          <w:b w:val="0"/>
+          <w:i w:val="0"/>
+          <w:color w:val="000000"/>
+          <w:sz w:val="24"/>
+        </w:rPr>
+        <w:t>.</w:t>
+      </w:r>
+    </w:p>
+    <w:p>
+      <w:pPr>
+        <w:pStyle w:val="ListBullet"/>
+        <w:spacing w:after="80" w:line="276" w:lineRule="auto"/>
+      </w:pPr>
+      <w:r>
+        <w:rPr>
+          <w:rFonts w:ascii="Times New Roman" w:hAnsi="Times New Roman"/>
+          <w:b w:val="0"/>
+          <w:i w:val="0"/>
+          <w:color w:val="000000"/>
+          <w:sz w:val="24"/>
+        </w:rPr>
+        <w:t xml:space="preserve">Fu, C., Chen, P., Shen, Y., Qin, Y., Zhang, M., Lin, X., et al. (2026). MME: A comprehensive evaluation benchmark for multimodal large language models. </w:t>
+      </w:r>
+      <w:r>
+        <w:rPr>
+          <w:rFonts w:ascii="Times New Roman" w:hAnsi="Times New Roman"/>
+          <w:b w:val="0"/>
+          <w:i/>
+          <w:color w:val="000000"/>
+          <w:sz w:val="24"/>
+        </w:rPr>
+        <w:t>In Neural Information Processing Systems Datasets and Benchmarks Track</w:t>
+      </w:r>
+      <w:r>
+        <w:rPr>
+          <w:rFonts w:ascii="Times New Roman" w:hAnsi="Times New Roman"/>
+          <w:b w:val="0"/>
+          <w:i w:val="0"/>
+          <w:color w:val="000000"/>
+          <w:sz w:val="24"/>
+        </w:rPr>
+        <w:t>.</w:t>
+      </w:r>
+    </w:p>
+    <w:p>
+      <w:pPr>
+        <w:pStyle w:val="ListBullet"/>
+        <w:spacing w:after="80" w:line="276" w:lineRule="auto"/>
+      </w:pPr>
+      <w:r>
+        <w:rPr>
+          <w:rFonts w:ascii="Times New Roman" w:hAnsi="Times New Roman"/>
+          <w:b w:val="0"/>
+          <w:i w:val="0"/>
+          <w:color w:val="000000"/>
+          <w:sz w:val="24"/>
+        </w:rPr>
+        <w:t xml:space="preserve">Li, Y., Du, Y., Zhou, K., Wang, J., Zhao, X., and Wen, J. (2023b). Evaluating object hallucination in large vision-language models. </w:t>
+      </w:r>
+      <w:r>
+        <w:rPr>
+          <w:rFonts w:ascii="Times New Roman" w:hAnsi="Times New Roman"/>
+          <w:b w:val="0"/>
+          <w:i/>
+          <w:color w:val="000000"/>
+          <w:sz w:val="24"/>
+        </w:rPr>
+        <w:t>In Proceedings of the 2023 Conference on Empirical Methods in Natural Language Processing (EMNLP)</w:t>
+      </w:r>
+      <w:r>
+        <w:rPr>
+          <w:rFonts w:ascii="Times New Roman" w:hAnsi="Times New Roman"/>
+          <w:b w:val="0"/>
+          <w:i w:val="0"/>
+          <w:color w:val="000000"/>
+          <w:sz w:val="24"/>
+        </w:rPr>
+        <w:t>.</w:t>
+      </w:r>
+    </w:p>
+    <w:p>
+      <w:pPr>
+        <w:pStyle w:val="ListBullet"/>
+        <w:spacing w:after="80" w:line="276" w:lineRule="auto"/>
+      </w:pPr>
+      <w:r>
+        <w:rPr>
+          <w:rFonts w:ascii="Times New Roman" w:hAnsi="Times New Roman"/>
+          <w:b w:val="0"/>
+          <w:i w:val="0"/>
+          <w:color w:val="000000"/>
+          <w:sz w:val="24"/>
+        </w:rPr>
+        <w:t xml:space="preserve">Liu, H., Li, C., Li, Y., and Lee, Y. J. (2024). Improved baselines with visual instruction tuning. </w:t>
+      </w:r>
+      <w:r>
+        <w:rPr>
+          <w:rFonts w:ascii="Times New Roman" w:hAnsi="Times New Roman"/>
+          <w:b w:val="0"/>
+          <w:i/>
+          <w:color w:val="000000"/>
+          <w:sz w:val="24"/>
+        </w:rPr>
+        <w:t>CVPR 2024</w:t>
+      </w:r>
+      <w:r>
+        <w:rPr>
+          <w:rFonts w:ascii="Times New Roman" w:hAnsi="Times New Roman"/>
+          <w:b w:val="0"/>
+          <w:i w:val="0"/>
+          <w:color w:val="000000"/>
+          <w:sz w:val="24"/>
+        </w:rPr>
+        <w:t>.</w:t>
+      </w:r>
+    </w:p>
+    <w:p>
+      <w:pPr>
+        <w:pStyle w:val="ListBullet"/>
+        <w:spacing w:after="80" w:line="276" w:lineRule="auto"/>
+      </w:pPr>
+      <w:r>
+        <w:rPr>
+          <w:rFonts w:ascii="Times New Roman" w:hAnsi="Times New Roman"/>
+          <w:b w:val="0"/>
+          <w:i w:val="0"/>
+          <w:color w:val="000000"/>
+          <w:sz w:val="24"/>
+        </w:rPr>
+        <w:t xml:space="preserve">Team, G., Kamath, A., Ferret, J., Pathak, S., Vieillard, N., et al. (2025). Gemma 3 technical report. </w:t>
+      </w:r>
+      <w:r>
+        <w:rPr>
+          <w:rFonts w:ascii="Times New Roman" w:hAnsi="Times New Roman"/>
+          <w:b w:val="0"/>
+          <w:i/>
+          <w:color w:val="000000"/>
+          <w:sz w:val="24"/>
+        </w:rPr>
+        <w:t>arXiv preprint arXiv:2503.19786</w:t>
+      </w:r>
+      <w:r>
+        <w:rPr>
+          <w:rFonts w:ascii="Times New Roman" w:hAnsi="Times New Roman"/>
+          <w:b w:val="0"/>
+          <w:i w:val="0"/>
+          <w:color w:val="000000"/>
+          <w:sz w:val="24"/>
+        </w:rPr>
+        <w:t>.</w:t>
+      </w:r>
+    </w:p>
+    <w:p>
+      <w:pPr>
+        <w:pStyle w:val="ListBullet"/>
+        <w:spacing w:after="80" w:line="276" w:lineRule="auto"/>
+      </w:pPr>
+      <w:r>
+        <w:rPr>
+          <w:rFonts w:ascii="Times New Roman" w:hAnsi="Times New Roman"/>
+          <w:b w:val="0"/>
+          <w:i w:val="0"/>
+          <w:color w:val="000000"/>
+          <w:sz w:val="24"/>
+        </w:rPr>
+        <w:t xml:space="preserve">Wang, J., Wang, Y., Xu, G., Zhang, J., Gu, Y., Jia, H., et al. (2024). Amber: An llm-free multi-dimensional benchmark for mllms hallucination evaluation. </w:t>
+      </w:r>
+      <w:r>
+        <w:rPr>
+          <w:rFonts w:ascii="Times New Roman" w:hAnsi="Times New Roman"/>
+          <w:b w:val="0"/>
+          <w:i/>
+          <w:color w:val="000000"/>
+          <w:sz w:val="24"/>
+        </w:rPr>
+        <w:t>arXiv preprint arXiv:2311.07397</w:t>
+      </w:r>
+      <w:r>
+        <w:rPr>
+          <w:rFonts w:ascii="Times New Roman" w:hAnsi="Times New Roman"/>
+          <w:b w:val="0"/>
+          <w:i w:val="0"/>
+          <w:color w:val="000000"/>
+          <w:sz w:val="24"/>
+        </w:rPr>
+        <w:t>.</w:t>
+      </w:r>
+    </w:p>
+    <w:p>
+      <w:pPr>
+        <w:pStyle w:val="ListBullet"/>
+        <w:spacing w:after="80" w:line="276" w:lineRule="auto"/>
+      </w:pPr>
+      <w:r>
+        <w:rPr>
+          <w:rFonts w:ascii="Times New Roman" w:hAnsi="Times New Roman"/>
+          <w:b w:val="0"/>
+          <w:i w:val="0"/>
+          <w:color w:val="000000"/>
+          <w:sz w:val="24"/>
+        </w:rPr>
+        <w:t xml:space="preserve">Wang, W., Gao, Z., Gu, L., Pu, H., Cui, L., et al. (2025). Internvl3.5: Advancing open-source multimodal models in versatility, reasoning, and efficiency. </w:t>
+      </w:r>
+      <w:r>
+        <w:rPr>
+          <w:rFonts w:ascii="Times New Roman" w:hAnsi="Times New Roman"/>
+          <w:b w:val="0"/>
+          <w:i/>
+          <w:color w:val="000000"/>
+          <w:sz w:val="24"/>
+        </w:rPr>
+        <w:t>arXiv preprint arXiv:2508.18265</w:t>
+      </w:r>
+      <w:r>
+        <w:rPr>
+          <w:rFonts w:ascii="Times New Roman" w:hAnsi="Times New Roman"/>
+          <w:b w:val="0"/>
+          <w:i w:val="0"/>
+          <w:color w:val="000000"/>
+          <w:sz w:val="24"/>
+        </w:rPr>
+        <w:t>.</w:t>
+      </w:r>
+    </w:p>
+    <w:p>
+      <w:pPr>
+        <w:pStyle w:val="ListBullet"/>
+        <w:spacing w:after="80" w:line="276" w:lineRule="auto"/>
+      </w:pPr>
+      <w:r>
+        <w:rPr>
+          <w:rFonts w:ascii="Times New Roman" w:hAnsi="Times New Roman"/>
+          <w:b w:val="0"/>
+          <w:i w:val="0"/>
+          <w:color w:val="000000"/>
+          <w:sz w:val="24"/>
+        </w:rPr>
+        <w:t xml:space="preserve">Xu, H., Mei, X., Yan, Y., Zhou, R., Zhang, W., et al. (2025). Easysteer: A unified framework for high-performance and extensible llm steering. </w:t>
+      </w:r>
+      <w:r>
+        <w:rPr>
+          <w:rFonts w:ascii="Times New Roman" w:hAnsi="Times New Roman"/>
+          <w:b w:val="0"/>
+          <w:i/>
+          <w:color w:val="000000"/>
+          <w:sz w:val="24"/>
+        </w:rPr>
+        <w:t>arXiv preprint arXiv:2509.25175</w:t>
+      </w:r>
+      <w:r>
+        <w:rPr>
+          <w:rFonts w:ascii="Times New Roman" w:hAnsi="Times New Roman"/>
+          <w:b w:val="0"/>
+          <w:i w:val="0"/>
+          <w:color w:val="000000"/>
+          <w:sz w:val="24"/>
+        </w:rPr>
+        <w:t>.</w:t>
+      </w:r>
+    </w:p>
+    <w:p>
+      <w:pPr>
+        <w:pStyle w:val="ListBullet"/>
+        <w:spacing w:after="80" w:line="276" w:lineRule="auto"/>
+      </w:pPr>
+      <w:r>
+        <w:rPr>
+          <w:rFonts w:ascii="Times New Roman" w:hAnsi="Times New Roman"/>
+          <w:b w:val="0"/>
+          <w:i w:val="0"/>
+          <w:color w:val="000000"/>
+          <w:sz w:val="24"/>
+        </w:rPr>
+        <w:t xml:space="preserve">Zhu, J., Wang, W., Chen, Z., Liu, Z., Ye, S., et al. (2025). Internvl3: Exploring advanced training and test-time recipes for open-source multimodal models. </w:t>
+      </w:r>
+      <w:r>
+        <w:rPr>
+          <w:rFonts w:ascii="Times New Roman" w:hAnsi="Times New Roman"/>
+          <w:b w:val="0"/>
+          <w:i/>
+          <w:color w:val="000000"/>
+          <w:sz w:val="24"/>
+        </w:rPr>
+        <w:t>arXiv preprint arXiv:2504.10479</w:t>
+      </w:r>
+      <w:r>
+        <w:rPr>
+          <w:rFonts w:ascii="Times New Roman" w:hAnsi="Times New Roman"/>
+          <w:b w:val="0"/>
+          <w:i w:val="0"/>
+          <w:color w:val="000000"/>
+          <w:sz w:val="24"/>
+        </w:rPr>
+        <w:t>.</w:t>
+      </w:r>
+    </w:p>
+    <w:p>
+      <w:pPr>
+        <w:spacing w:after="80"/>
+      </w:pPr>
+    </w:p>
+    <w:p>
+      <w:pPr>
+        <w:keepNext/>
+        <w:spacing w:before="280" w:after="120"/>
+      </w:pPr>
+      <w:r>
+        <w:rPr>
+          <w:rFonts w:ascii="Times New Roman" w:hAnsi="Times New Roman"/>
+          <w:b/>
+          <w:i w:val="0"/>
+          <w:color w:val="0E7490"/>
+          <w:sz w:val="28"/>
+        </w:rPr>
+        <w:t>Appendix</w:t>
+      </w:r>
+    </w:p>
+    <w:p>
+      <w:pPr>
+        <w:spacing w:after="80"/>
+      </w:pPr>
+    </w:p>
+    <w:p>
+      <w:pPr>
+        <w:keepNext/>
+        <w:spacing w:before="200" w:after="80"/>
+      </w:pPr>
+      <w:r>
+        <w:rPr>
+          <w:rFonts w:ascii="Times New Roman" w:hAnsi="Times New Roman"/>
+          <w:b/>
+          <w:i w:val="0"/>
+          <w:color w:val="7C3AED"/>
+          <w:sz w:val="24"/>
+        </w:rPr>
+        <w:t>Prompt Wording Ablation Study</w:t>
+      </w:r>
+    </w:p>
+    <w:p>
+      <w:pPr>
+        <w:spacing w:after="160" w:line="276" w:lineRule="auto"/>
+        <w:jc w:val="left"/>
+      </w:pPr>
+      <w:r>
+        <w:rPr>
+          <w:rFonts w:ascii="Times New Roman" w:hAnsi="Times New Roman"/>
+          <w:b w:val="0"/>
+          <w:i w:val="0"/>
+          <w:color w:val="000000"/>
+          <w:sz w:val="24"/>
+        </w:rPr>
+        <w:t>To ensure the existence-localization contradiction was not an artifact of a single grounding template, we conducted an ablation study using 5 prompt variants for each model family. Table 3 presents the mean CELF score and its standard deviation across prompts, demonstrating that InternVL3.5-8B consistently suffers from 0.0% CELF across all prompt variants, while the Qwen models show higher variance but maintain low overall faithfulness.</w:t>
+      </w:r>
+    </w:p>
+    <w:p>
+      <w:pPr>
+        <w:spacing w:after="80"/>
+      </w:pPr>
+    </w:p>
+    <w:p>
+      <w:pPr>
+        <w:keepNext/>
+        <w:spacing w:before="200" w:after="80"/>
+      </w:pPr>
+      <w:r>
+        <w:rPr>
+          <w:rFonts w:ascii="Times New Roman" w:hAnsi="Times New Roman"/>
+          <w:b/>
+          <w:i w:val="0"/>
+          <w:color w:val="7C3AED"/>
+          <w:sz w:val="24"/>
+        </w:rPr>
+        <w:t>Qwen Localization Prompt Templates</w:t>
+      </w:r>
+    </w:p>
+    <w:p>
+      <w:pPr>
         <w:spacing w:after="80" w:line="276" w:lineRule="auto"/>
         <w:ind w:left="360"/>
       </w:pPr>
@@ -4967,22 +6515,22 @@
       <w:r>
         <w:rPr>
           <w:rFonts w:ascii="Times New Roman" w:hAnsi="Times New Roman"/>
-          <w:b/>
-          <w:i w:val="0"/>
-          <w:color w:val="000000"/>
-          <w:sz w:val="24"/>
-        </w:rPr>
-        <w:t>Pervasive Contradictions</w:t>
-      </w:r>
-      <w:r>
-        <w:rPr>
-          <w:rFonts w:ascii="Times New Roman" w:hAnsi="Times New Roman"/>
           <w:b w:val="0"/>
-          <w:i w:val="0"/>
-          <w:color w:val="000000"/>
-          <w:sz w:val="24"/>
-        </w:rPr>
-        <w:t>: High existence accuracy in VLMs is a false signal of safety. Under spatial grounding prompts, models consistently fail to act on their semantic knowledge of object absence.</w:t>
+          <w:i/>
+          <w:color w:val="000000"/>
+          <w:sz w:val="24"/>
+        </w:rPr>
+        <w:t>"Locate a/an {object} in the image and identify its bounding box if it exists."</w:t>
+      </w:r>
+      <w:r>
+        <w:rPr>
+          <w:rFonts w:ascii="Times New Roman" w:hAnsi="Times New Roman"/>
+          <w:b w:val="0"/>
+          <w:i w:val="0"/>
+          <w:color w:val="000000"/>
+          <w:sz w:val="24"/>
+        </w:rPr>
+        <w:t xml:space="preserve"> (Default)</w:t>
       </w:r>
     </w:p>
     <w:p>
@@ -5012,22 +6560,21 @@
       <w:r>
         <w:rPr>
           <w:rFonts w:ascii="Times New Roman" w:hAnsi="Times New Roman"/>
-          <w:b/>
-          <w:i w:val="0"/>
-          <w:color w:val="000000"/>
-          <w:sz w:val="24"/>
-        </w:rPr>
-        <w:t>Topological Disconnect</w:t>
-      </w:r>
-      <w:r>
-        <w:rPr>
-          <w:rFonts w:ascii="Times New Roman" w:hAnsi="Times New Roman"/>
           <w:b w:val="0"/>
-          <w:i w:val="0"/>
-          <w:color w:val="000000"/>
-          <w:sz w:val="24"/>
-        </w:rPr>
-        <w:t>: PCA probing reveals that existence and localization tasks form isolated representation clusters, preventing effective multi-task logic sharing.</w:t>
+          <w:i/>
+          <w:color w:val="000000"/>
+          <w:sz w:val="24"/>
+        </w:rPr>
+        <w:t>"Locate a/an {object} in the image and identify its bounding box."</w:t>
+      </w:r>
+      <w:r>
+        <w:rPr>
+          <w:rFonts w:ascii="Times New Roman" w:hAnsi="Times New Roman"/>
+          <w:b w:val="0"/>
+          <w:i w:val="0"/>
+          <w:color w:val="000000"/>
+          <w:sz w:val="24"/>
+        </w:rPr>
       </w:r>
     </w:p>
     <w:p>
@@ -5057,31 +6604,118 @@
       <w:r>
         <w:rPr>
           <w:rFonts w:ascii="Times New Roman" w:hAnsi="Times New Roman"/>
-          <w:b/>
-          <w:i w:val="0"/>
-          <w:color w:val="000000"/>
-          <w:sz w:val="24"/>
-        </w:rPr>
-        <w:t>Causal Control via Latent Steering</w:t>
-      </w:r>
-      <w:r>
-        <w:rPr>
-          <w:rFonts w:ascii="Times New Roman" w:hAnsi="Times New Roman"/>
           <w:b w:val="0"/>
-          <w:i w:val="0"/>
-          <w:color w:val="000000"/>
-          <w:sz w:val="24"/>
-        </w:rPr>
-        <w:t>: By computing a simple difference-in-means steering vector ($s^{(l)} = \text{mean}(h_{abs} - h_{loc})$) at layers 7–13, we can successfully restore absence-consistent refusal, lifting CELF scores from 0% to over 70% in leading architectures.</w:t>
+          <w:i/>
+          <w:color w:val="000000"/>
+          <w:sz w:val="24"/>
+        </w:rPr>
+        <w:t>"Search the image for a/an {object} and provide its bounding box if it is visible."</w:t>
+      </w:r>
+      <w:r>
+        <w:rPr>
+          <w:rFonts w:ascii="Times New Roman" w:hAnsi="Times New Roman"/>
+          <w:b w:val="0"/>
+          <w:i w:val="0"/>
+          <w:color w:val="000000"/>
+          <w:sz w:val="24"/>
+        </w:rPr>
       </w:r>
     </w:p>
     <w:p>
       <w:pPr>
-        <w:spacing w:after="80"/>
-      </w:pPr>
+        <w:spacing w:after="80" w:line="276" w:lineRule="auto"/>
+        <w:ind w:left="360"/>
+      </w:pPr>
+      <w:r>
+        <w:rPr>
+          <w:rFonts w:ascii="Times New Roman" w:hAnsi="Times New Roman"/>
+          <w:b/>
+          <w:i w:val="0"/>
+          <w:color w:val="000000"/>
+          <w:sz w:val="24"/>
+        </w:rPr>
+        <w:t xml:space="preserve">4. </w:t>
+      </w:r>
+      <w:r>
+        <w:rPr>
+          <w:rFonts w:ascii="Times New Roman" w:hAnsi="Times New Roman"/>
+          <w:b w:val="0"/>
+          <w:i w:val="0"/>
+          <w:color w:val="000000"/>
+          <w:sz w:val="24"/>
+        </w:rPr>
+      </w:r>
+      <w:r>
+        <w:rPr>
+          <w:rFonts w:ascii="Times New Roman" w:hAnsi="Times New Roman"/>
+          <w:b w:val="0"/>
+          <w:i/>
+          <w:color w:val="000000"/>
+          <w:sz w:val="24"/>
+        </w:rPr>
+        <w:t>"Detect all instances of {object} in the image and return their locations in the form of coordinates."</w:t>
+      </w:r>
+      <w:r>
+        <w:rPr>
+          <w:rFonts w:ascii="Times New Roman" w:hAnsi="Times New Roman"/>
+          <w:b w:val="0"/>
+          <w:i w:val="0"/>
+          <w:color w:val="000000"/>
+          <w:sz w:val="24"/>
+        </w:rPr>
+      </w:r>
     </w:p>
     <w:p>
       <w:pPr>
+        <w:spacing w:after="80" w:line="276" w:lineRule="auto"/>
+        <w:ind w:left="360"/>
+      </w:pPr>
+      <w:r>
+        <w:rPr>
+          <w:rFonts w:ascii="Times New Roman" w:hAnsi="Times New Roman"/>
+          <w:b/>
+          <w:i w:val="0"/>
+          <w:color w:val="000000"/>
+          <w:sz w:val="24"/>
+        </w:rPr>
+        <w:t xml:space="preserve">5. </w:t>
+      </w:r>
+      <w:r>
+        <w:rPr>
+          <w:rFonts w:ascii="Times New Roman" w:hAnsi="Times New Roman"/>
+          <w:b w:val="0"/>
+          <w:i w:val="0"/>
+          <w:color w:val="000000"/>
+          <w:sz w:val="24"/>
+        </w:rPr>
+      </w:r>
+      <w:r>
+        <w:rPr>
+          <w:rFonts w:ascii="Times New Roman" w:hAnsi="Times New Roman"/>
+          <w:b w:val="0"/>
+          <w:i/>
+          <w:color w:val="000000"/>
+          <w:sz w:val="24"/>
+        </w:rPr>
+        <w:t>"Identify a/an {object} within the picture and provide its bounding box if present."</w:t>
+      </w:r>
+      <w:r>
+        <w:rPr>
+          <w:rFonts w:ascii="Times New Roman" w:hAnsi="Times New Roman"/>
+          <w:b w:val="0"/>
+          <w:i w:val="0"/>
+          <w:color w:val="000000"/>
+          <w:sz w:val="24"/>
+        </w:rPr>
+      </w:r>
+    </w:p>
+    <w:p>
+      <w:pPr>
+        <w:spacing w:after="80"/>
+      </w:pPr>
+    </w:p>
+    <w:p>
+      <w:pPr>
         <w:keepNext/>
         <w:spacing w:before="200" w:after="80"/>
       </w:pPr>
@@ -5093,1835 +6727,7 @@
           <w:color w:val="7C3AED"/>
           <w:sz w:val="24"/>
         </w:rPr>
-        <w:t>3.2 Insights and Implications for Multimodal NLP</w:t>
-      </w:r>
-    </w:p>
-    <w:p>
-      <w:pPr>
-        <w:spacing w:after="160" w:line="276" w:lineRule="auto"/>
-        <w:jc w:val="left"/>
-      </w:pPr>
-      <w:r>
-        <w:rPr>
-          <w:rFonts w:ascii="Times New Roman" w:hAnsi="Times New Roman"/>
-          <w:b w:val="0"/>
-          <w:i w:val="0"/>
-          <w:color w:val="000000"/>
-          <w:sz w:val="24"/>
-        </w:rPr>
-        <w:t>This study has deep implications for building robust multimodal agents. If a robot or a web agent relies on visual grounding to perform physical actions (e.g., clicking a button or grasping an object), using standard VLMs exposes the system to catastrophic action failures due to presupposition hallucinations. Our findings encourage VLM developers to:</w:t>
-      </w:r>
-    </w:p>
-    <w:p>
-      <w:pPr>
-        <w:pStyle w:val="ListBullet"/>
-        <w:spacing w:after="80" w:line="276" w:lineRule="auto"/>
-      </w:pPr>
-      <w:r>
-        <w:rPr>
-          <w:rFonts w:ascii="Times New Roman" w:hAnsi="Times New Roman"/>
-          <w:b w:val="0"/>
-          <w:i w:val="0"/>
-          <w:color w:val="000000"/>
-          <w:sz w:val="24"/>
-        </w:rPr>
-        <w:t>Avoid training grounding as a pure coordinate-regression task.</w:t>
-      </w:r>
-    </w:p>
-    <w:p>
-      <w:pPr>
-        <w:pStyle w:val="ListBullet"/>
-        <w:spacing w:after="80" w:line="276" w:lineRule="auto"/>
-      </w:pPr>
-      <w:r>
-        <w:rPr>
-          <w:rFonts w:ascii="Times New Roman" w:hAnsi="Times New Roman"/>
-          <w:b w:val="0"/>
-          <w:i w:val="0"/>
-          <w:color w:val="000000"/>
-          <w:sz w:val="24"/>
-        </w:rPr>
-        <w:t>Incorporate negative-grounding contrastive samples directly in pretraining.</w:t>
-      </w:r>
-    </w:p>
-    <w:p>
-      <w:pPr>
-        <w:pStyle w:val="ListBullet"/>
-        <w:spacing w:after="80" w:line="276" w:lineRule="auto"/>
-      </w:pPr>
-      <w:r>
-        <w:rPr>
-          <w:rFonts w:ascii="Times New Roman" w:hAnsi="Times New Roman"/>
-          <w:b w:val="0"/>
-          <w:i w:val="0"/>
-          <w:color w:val="000000"/>
-          <w:sz w:val="24"/>
-        </w:rPr>
-        <w:t>Utilize inference-time activation steering as a parameter-free guardrail to enforce semantic consistency.</w:t>
-      </w:r>
-    </w:p>
-    <w:p>
-      <w:pPr>
-        <w:spacing w:after="80"/>
-      </w:pPr>
-    </w:p>
-    <w:p>
-      <w:pPr>
-        <w:spacing w:after="240"/>
-        <w:jc w:val="center"/>
-      </w:pPr>
-      <w:r>
-        <w:rPr>
-          <w:rFonts w:ascii="Times New Roman" w:hAnsi="Times New Roman"/>
-          <w:b w:val="0"/>
-          <w:i w:val="0"/>
-          <w:color w:val="C8C8C8"/>
-          <w:sz w:val="20"/>
-        </w:rPr>
-        <w:t>__________________________________________________________________</w:t>
-      </w:r>
-    </w:p>
-    <w:p>
-      <w:pPr>
-        <w:spacing w:after="80"/>
-      </w:pPr>
-    </w:p>
-    <w:p>
-      <w:pPr>
-        <w:keepNext/>
-        <w:spacing w:before="280" w:after="120"/>
-      </w:pPr>
-      <w:r>
-        <w:rPr>
-          <w:rFonts w:ascii="Times New Roman" w:hAnsi="Times New Roman"/>
-          <w:b/>
-          <w:i w:val="0"/>
-          <w:color w:val="0E7490"/>
-          <w:sz w:val="28"/>
-        </w:rPr>
-        <w:t>4. Pipeline Reflection</w:t>
-      </w:r>
-    </w:p>
-    <w:p>
-      <w:pPr>
-        <w:spacing w:after="80"/>
-      </w:pPr>
-    </w:p>
-    <w:p>
-      <w:pPr>
-        <w:spacing w:after="160" w:line="276" w:lineRule="auto"/>
-        <w:jc w:val="left"/>
-      </w:pPr>
-      <w:r>
-        <w:rPr>
-          <w:rFonts w:ascii="Times New Roman" w:hAnsi="Times New Roman"/>
-          <w:b w:val="0"/>
-          <w:i w:val="0"/>
-          <w:color w:val="000000"/>
-          <w:sz w:val="24"/>
-        </w:rPr>
-        <w:t>As a team, we structured our work to strictly mirror the core phases of the NLP pipeline:</w:t>
-      </w:r>
-    </w:p>
-    <w:p>
-      <w:pPr>
-        <w:spacing w:after="80"/>
-      </w:pPr>
-    </w:p>
-    <w:p>
-      <w:pPr>
-        <w:spacing w:after="40"/>
-        <w:ind w:left="720"/>
-      </w:pPr>
-      <w:r>
-        <w:rPr>
-          <w:rFonts w:ascii="Consolas" w:hAnsi="Consolas"/>
-          <w:b w:val="0"/>
-          <w:i w:val="0"/>
-          <w:color w:val="646E78"/>
-          <w:sz w:val="20"/>
-        </w:rPr>
-        <w:t>[NLP Pipeline Flow]</w:t>
-      </w:r>
-    </w:p>
-    <w:p>
-      <w:pPr>
-        <w:spacing w:after="40"/>
-        <w:ind w:left="720"/>
-      </w:pPr>
-      <w:r>
-        <w:rPr>
-          <w:rFonts w:ascii="Consolas" w:hAnsi="Consolas"/>
-          <w:b w:val="0"/>
-          <w:i w:val="0"/>
-          <w:color w:val="646E78"/>
-          <w:sz w:val="20"/>
-        </w:rPr>
-        <w:t xml:space="preserve">  +-----------------+     +-----------------------+     +--------------------+     +-------------------+</w:t>
-      </w:r>
-    </w:p>
-    <w:p>
-      <w:pPr>
-        <w:spacing w:after="40"/>
-        <w:ind w:left="720"/>
-      </w:pPr>
-      <w:r>
-        <w:rPr>
-          <w:rFonts w:ascii="Consolas" w:hAnsi="Consolas"/>
-          <w:b w:val="0"/>
-          <w:i w:val="0"/>
-          <w:color w:val="646E78"/>
-          <w:sz w:val="20"/>
-        </w:rPr>
-        <w:t xml:space="preserve">  | 1. Preprocessing | --&gt; | 2. Representation     | --&gt; | 3. Modelling       | --&gt; | 4. Evaluation     |</w:t>
-      </w:r>
-    </w:p>
-    <w:p>
-      <w:pPr>
-        <w:spacing w:after="40"/>
-        <w:ind w:left="720"/>
-      </w:pPr>
-      <w:r>
-        <w:rPr>
-          <w:rFonts w:ascii="Consolas" w:hAnsi="Consolas"/>
-          <w:b w:val="0"/>
-          <w:i w:val="0"/>
-          <w:color w:val="646E78"/>
-          <w:sz w:val="20"/>
-        </w:rPr>
-        <w:t xml:space="preserve">  |  - XML/Tag Parse |     |  - Latent Extraction  |     |  - EasySteer       |     |  - CELF, NLP, EA  |</w:t>
-      </w:r>
-    </w:p>
-    <w:p>
-      <w:pPr>
-        <w:spacing w:after="40"/>
-        <w:ind w:left="720"/>
-      </w:pPr>
-      <w:r>
-        <w:rPr>
-          <w:rFonts w:ascii="Consolas" w:hAnsi="Consolas"/>
-          <w:b w:val="0"/>
-          <w:i w:val="0"/>
-          <w:color w:val="646E78"/>
-          <w:sz w:val="20"/>
-        </w:rPr>
-        <w:t xml:space="preserve">  |  - Prompt Align  |     |  - PCA Dimensionality |     |  - Hidden Injection|     |  - Ablation Study |</w:t>
-      </w:r>
-    </w:p>
-    <w:p>
-      <w:pPr>
-        <w:spacing w:after="40"/>
-        <w:ind w:left="720"/>
-      </w:pPr>
-      <w:r>
-        <w:rPr>
-          <w:rFonts w:ascii="Consolas" w:hAnsi="Consolas"/>
-          <w:b w:val="0"/>
-          <w:i w:val="0"/>
-          <w:color w:val="646E78"/>
-          <w:sz w:val="20"/>
-        </w:rPr>
-        <w:t xml:space="preserve">  +-----------------+     +-----------------------+     +--------------------+     +-------------------+</w:t>
-      </w:r>
-    </w:p>
-    <w:p>
-      <w:pPr>
-        <w:spacing w:after="80"/>
-      </w:pPr>
-    </w:p>
-    <w:p>
-      <w:pPr>
-        <w:keepNext/>
-        <w:spacing w:before="200" w:after="80"/>
-      </w:pPr>
-      <w:r>
-        <w:rPr>
-          <w:rFonts w:ascii="Times New Roman" w:hAnsi="Times New Roman"/>
-          <w:b/>
-          <w:i w:val="0"/>
-          <w:color w:val="7C3AED"/>
-          <w:sz w:val="24"/>
-        </w:rPr>
-        <w:t>4.1 Preprocessing</w:t>
-      </w:r>
-    </w:p>
-    <w:p>
-      <w:pPr>
-        <w:pStyle w:val="ListBullet"/>
-        <w:spacing w:after="80" w:line="276" w:lineRule="auto"/>
-      </w:pPr>
-      <w:r>
-        <w:rPr>
-          <w:rFonts w:ascii="Times New Roman" w:hAnsi="Times New Roman"/>
-          <w:b w:val="0"/>
-          <w:i w:val="0"/>
-          <w:color w:val="000000"/>
-          <w:sz w:val="24"/>
-        </w:rPr>
-      </w:r>
-      <w:r>
-        <w:rPr>
-          <w:rFonts w:ascii="Times New Roman" w:hAnsi="Times New Roman"/>
-          <w:b/>
-          <w:i w:val="0"/>
-          <w:color w:val="000000"/>
-          <w:sz w:val="24"/>
-        </w:rPr>
-        <w:t>Implementation</w:t>
-      </w:r>
-      <w:r>
-        <w:rPr>
-          <w:rFonts w:ascii="Times New Roman" w:hAnsi="Times New Roman"/>
-          <w:b w:val="0"/>
-          <w:i w:val="0"/>
-          <w:color w:val="000000"/>
-          <w:sz w:val="24"/>
-        </w:rPr>
-        <w:t>: We handled diverse template alignments. For Qwen, we used natural language instructions. For InternVL, we structured referring expression templates with `&lt;ref&gt;` tags.</w:t>
-      </w:r>
-    </w:p>
-    <w:p>
-      <w:pPr>
-        <w:pStyle w:val="ListBullet"/>
-        <w:spacing w:after="80" w:line="276" w:lineRule="auto"/>
-      </w:pPr>
-      <w:r>
-        <w:rPr>
-          <w:rFonts w:ascii="Times New Roman" w:hAnsi="Times New Roman"/>
-          <w:b w:val="0"/>
-          <w:i w:val="0"/>
-          <w:color w:val="000000"/>
-          <w:sz w:val="24"/>
-        </w:rPr>
-      </w:r>
-      <w:r>
-        <w:rPr>
-          <w:rFonts w:ascii="Times New Roman" w:hAnsi="Times New Roman"/>
-          <w:b/>
-          <w:i w:val="0"/>
-          <w:color w:val="000000"/>
-          <w:sz w:val="24"/>
-        </w:rPr>
-        <w:t>Challenge</w:t>
-      </w:r>
-      <w:r>
-        <w:rPr>
-          <w:rFonts w:ascii="Times New Roman" w:hAnsi="Times New Roman"/>
-          <w:b w:val="0"/>
-          <w:i w:val="0"/>
-          <w:color w:val="000000"/>
-          <w:sz w:val="24"/>
-        </w:rPr>
-        <w:t>: Bounding boxes are output in different formats (e.g., normalized $[0, 1000]$ vs $[0, 1]$). Preprocessing required building robust regular expression parsers to standardise coordinate extraction.</w:t>
-      </w:r>
-    </w:p>
-    <w:p>
-      <w:pPr>
-        <w:spacing w:after="80"/>
-      </w:pPr>
-    </w:p>
-    <w:p>
-      <w:pPr>
-        <w:keepNext/>
-        <w:spacing w:before="200" w:after="80"/>
-      </w:pPr>
-      <w:r>
-        <w:rPr>
-          <w:rFonts w:ascii="Times New Roman" w:hAnsi="Times New Roman"/>
-          <w:b/>
-          <w:i w:val="0"/>
-          <w:color w:val="7C3AED"/>
-          <w:sz w:val="24"/>
-        </w:rPr>
-        <w:t>4.2 Representation</w:t>
-      </w:r>
-    </w:p>
-    <w:p>
-      <w:pPr>
-        <w:pStyle w:val="ListBullet"/>
-        <w:spacing w:after="80" w:line="276" w:lineRule="auto"/>
-      </w:pPr>
-      <w:r>
-        <w:rPr>
-          <w:rFonts w:ascii="Times New Roman" w:hAnsi="Times New Roman"/>
-          <w:b w:val="0"/>
-          <w:i w:val="0"/>
-          <w:color w:val="000000"/>
-          <w:sz w:val="24"/>
-        </w:rPr>
-      </w:r>
-      <w:r>
-        <w:rPr>
-          <w:rFonts w:ascii="Times New Roman" w:hAnsi="Times New Roman"/>
-          <w:b/>
-          <w:i w:val="0"/>
-          <w:color w:val="000000"/>
-          <w:sz w:val="24"/>
-        </w:rPr>
-        <w:t>Implementation</w:t>
-      </w:r>
-      <w:r>
-        <w:rPr>
-          <w:rFonts w:ascii="Times New Roman" w:hAnsi="Times New Roman"/>
-          <w:b w:val="0"/>
-          <w:i w:val="0"/>
-          <w:color w:val="000000"/>
-          <w:sz w:val="24"/>
-        </w:rPr>
-        <w:t>: We probed Qwen's latent space, extracting hidden states at the final token position. We then applied PCA to reduce the 3584-dimensional representation space into 2D coordinates for analysis.</w:t>
-      </w:r>
-    </w:p>
-    <w:p>
-      <w:pPr>
-        <w:pStyle w:val="ListBullet"/>
-        <w:spacing w:after="80" w:line="276" w:lineRule="auto"/>
-      </w:pPr>
-      <w:r>
-        <w:rPr>
-          <w:rFonts w:ascii="Times New Roman" w:hAnsi="Times New Roman"/>
-          <w:b w:val="0"/>
-          <w:i w:val="0"/>
-          <w:color w:val="000000"/>
-          <w:sz w:val="24"/>
-        </w:rPr>
-      </w:r>
-      <w:r>
-        <w:rPr>
-          <w:rFonts w:ascii="Times New Roman" w:hAnsi="Times New Roman"/>
-          <w:b/>
-          <w:i w:val="0"/>
-          <w:color w:val="000000"/>
-          <w:sz w:val="24"/>
-        </w:rPr>
-        <w:t>Challenge</w:t>
-      </w:r>
-      <w:r>
-        <w:rPr>
-          <w:rFonts w:ascii="Times New Roman" w:hAnsi="Times New Roman"/>
-          <w:b w:val="0"/>
-          <w:i w:val="0"/>
-          <w:color w:val="000000"/>
-          <w:sz w:val="24"/>
-        </w:rPr>
-        <w:t>: Intermediate states are highly sensitive to sequence length. We aligned token positions across varied templates to guarantee that we were extracting semantically equivalent states.</w:t>
-      </w:r>
-    </w:p>
-    <w:p>
-      <w:pPr>
-        <w:spacing w:after="80"/>
-      </w:pPr>
-    </w:p>
-    <w:p>
-      <w:pPr>
-        <w:keepNext/>
-        <w:spacing w:before="200" w:after="80"/>
-      </w:pPr>
-      <w:r>
-        <w:rPr>
-          <w:rFonts w:ascii="Times New Roman" w:hAnsi="Times New Roman"/>
-          <w:b/>
-          <w:i w:val="0"/>
-          <w:color w:val="7C3AED"/>
-          <w:sz w:val="24"/>
-        </w:rPr>
-        <w:t>4.3 Modelling</w:t>
-      </w:r>
-    </w:p>
-    <w:p>
-      <w:pPr>
-        <w:pStyle w:val="ListBullet"/>
-        <w:spacing w:after="80" w:line="276" w:lineRule="auto"/>
-      </w:pPr>
-      <w:r>
-        <w:rPr>
-          <w:rFonts w:ascii="Times New Roman" w:hAnsi="Times New Roman"/>
-          <w:b w:val="0"/>
-          <w:i w:val="0"/>
-          <w:color w:val="000000"/>
-          <w:sz w:val="24"/>
-        </w:rPr>
-      </w:r>
-      <w:r>
-        <w:rPr>
-          <w:rFonts w:ascii="Times New Roman" w:hAnsi="Times New Roman"/>
-          <w:b/>
-          <w:i w:val="0"/>
-          <w:color w:val="000000"/>
-          <w:sz w:val="24"/>
-        </w:rPr>
-        <w:t>Implementation</w:t>
-      </w:r>
-      <w:r>
-        <w:rPr>
-          <w:rFonts w:ascii="Times New Roman" w:hAnsi="Times New Roman"/>
-          <w:b w:val="0"/>
-          <w:i w:val="0"/>
-          <w:color w:val="000000"/>
-          <w:sz w:val="24"/>
-        </w:rPr>
-        <w:t>: Rather than fine-tuning weights, we modelled the intervention mathematically in the latent space. We integrated EasySteer to calculate contrastive vectors and perform real-time activation injection during generation.</w:t>
-      </w:r>
-    </w:p>
-    <w:p>
-      <w:pPr>
-        <w:pStyle w:val="ListBullet"/>
-        <w:spacing w:after="80" w:line="276" w:lineRule="auto"/>
-      </w:pPr>
-      <w:r>
-        <w:rPr>
-          <w:rFonts w:ascii="Times New Roman" w:hAnsi="Times New Roman"/>
-          <w:b w:val="0"/>
-          <w:i w:val="0"/>
-          <w:color w:val="000000"/>
-          <w:sz w:val="24"/>
-        </w:rPr>
-      </w:r>
-      <w:r>
-        <w:rPr>
-          <w:rFonts w:ascii="Times New Roman" w:hAnsi="Times New Roman"/>
-          <w:b/>
-          <w:i w:val="0"/>
-          <w:color w:val="000000"/>
-          <w:sz w:val="24"/>
-        </w:rPr>
-        <w:t>Challenge</w:t>
-      </w:r>
-      <w:r>
-        <w:rPr>
-          <w:rFonts w:ascii="Times New Roman" w:hAnsi="Times New Roman"/>
-          <w:b w:val="0"/>
-          <w:i w:val="0"/>
-          <w:color w:val="000000"/>
-          <w:sz w:val="24"/>
-        </w:rPr>
-        <w:t>: Fine-tuning the balance of the steering coefficient $\alpha$ was crucial; over-steering could cause the model to over-abstain on positive grounding targets.</w:t>
-      </w:r>
-    </w:p>
-    <w:p>
-      <w:pPr>
-        <w:spacing w:after="80"/>
-      </w:pPr>
-    </w:p>
-    <w:p>
-      <w:pPr>
-        <w:keepNext/>
-        <w:spacing w:before="200" w:after="80"/>
-      </w:pPr>
-      <w:r>
-        <w:rPr>
-          <w:rFonts w:ascii="Times New Roman" w:hAnsi="Times New Roman"/>
-          <w:b/>
-          <w:i w:val="0"/>
-          <w:color w:val="7C3AED"/>
-          <w:sz w:val="24"/>
-        </w:rPr>
-        <w:t>4.4 Evaluation</w:t>
-      </w:r>
-    </w:p>
-    <w:p>
-      <w:pPr>
-        <w:pStyle w:val="ListBullet"/>
-        <w:spacing w:after="80" w:line="276" w:lineRule="auto"/>
-      </w:pPr>
-      <w:r>
-        <w:rPr>
-          <w:rFonts w:ascii="Times New Roman" w:hAnsi="Times New Roman"/>
-          <w:b w:val="0"/>
-          <w:i w:val="0"/>
-          <w:color w:val="000000"/>
-          <w:sz w:val="24"/>
-        </w:rPr>
-      </w:r>
-      <w:r>
-        <w:rPr>
-          <w:rFonts w:ascii="Times New Roman" w:hAnsi="Times New Roman"/>
-          <w:b/>
-          <w:i w:val="0"/>
-          <w:color w:val="000000"/>
-          <w:sz w:val="24"/>
-        </w:rPr>
-        <w:t>Implementation</w:t>
-      </w:r>
-      <w:r>
-        <w:rPr>
-          <w:rFonts w:ascii="Times New Roman" w:hAnsi="Times New Roman"/>
-          <w:b w:val="0"/>
-          <w:i w:val="0"/>
-          <w:color w:val="000000"/>
-          <w:sz w:val="24"/>
-        </w:rPr>
-        <w:t>: We implemented the conditional evaluation protocol to measure EA, NLP, and CELF. We also conducted prompt-template ablation studies to ensure results were not an artifact of template wording.</w:t>
-      </w:r>
-    </w:p>
-    <w:p>
-      <w:pPr>
-        <w:pStyle w:val="ListBullet"/>
-        <w:spacing w:after="80" w:line="276" w:lineRule="auto"/>
-      </w:pPr>
-      <w:r>
-        <w:rPr>
-          <w:rFonts w:ascii="Times New Roman" w:hAnsi="Times New Roman"/>
-          <w:b w:val="0"/>
-          <w:i w:val="0"/>
-          <w:color w:val="000000"/>
-          <w:sz w:val="24"/>
-        </w:rPr>
-      </w:r>
-      <w:r>
-        <w:rPr>
-          <w:rFonts w:ascii="Times New Roman" w:hAnsi="Times New Roman"/>
-          <w:b/>
-          <w:i w:val="0"/>
-          <w:color w:val="000000"/>
-          <w:sz w:val="24"/>
-        </w:rPr>
-        <w:t>Challenge</w:t>
-      </w:r>
-      <w:r>
-        <w:rPr>
-          <w:rFonts w:ascii="Times New Roman" w:hAnsi="Times New Roman"/>
-          <w:b w:val="0"/>
-          <w:i w:val="0"/>
-          <w:color w:val="000000"/>
-          <w:sz w:val="24"/>
-        </w:rPr>
-        <w:t>: Building an end-to-end reproducible pipeline that could load three distinct model families and evaluate them consistently on four benchmarks.</w:t>
-      </w:r>
-    </w:p>
-    <w:p>
-      <w:pPr>
-        <w:spacing w:after="80"/>
-      </w:pPr>
-    </w:p>
-    <w:p>
-      <w:pPr>
-        <w:spacing w:after="240"/>
-        <w:jc w:val="center"/>
-      </w:pPr>
-      <w:r>
-        <w:rPr>
-          <w:rFonts w:ascii="Times New Roman" w:hAnsi="Times New Roman"/>
-          <w:b w:val="0"/>
-          <w:i w:val="0"/>
-          <w:color w:val="C8C8C8"/>
-          <w:sz w:val="20"/>
-        </w:rPr>
-        <w:t>__________________________________________________________________</w:t>
-      </w:r>
-    </w:p>
-    <w:p>
-      <w:pPr>
-        <w:spacing w:after="80"/>
-      </w:pPr>
-    </w:p>
-    <w:p>
-      <w:pPr>
-        <w:keepNext/>
-        <w:spacing w:before="280" w:after="120"/>
-      </w:pPr>
-      <w:r>
-        <w:rPr>
-          <w:rFonts w:ascii="Times New Roman" w:hAnsi="Times New Roman"/>
-          <w:b/>
-          <w:i w:val="0"/>
-          <w:color w:val="0E7490"/>
-          <w:sz w:val="28"/>
-        </w:rPr>
-        <w:t>5. Team Contribution Statement</w:t>
-      </w:r>
-    </w:p>
-    <w:p>
-      <w:pPr>
-        <w:spacing w:after="80"/>
-      </w:pPr>
-    </w:p>
-    <w:p>
-      <w:pPr>
-        <w:spacing w:after="160" w:line="276" w:lineRule="auto"/>
-        <w:jc w:val="left"/>
-      </w:pPr>
-      <w:r>
-        <w:rPr>
-          <w:rFonts w:ascii="Times New Roman" w:hAnsi="Times New Roman"/>
-          <w:b w:val="0"/>
-          <w:i w:val="0"/>
-          <w:color w:val="000000"/>
-          <w:sz w:val="24"/>
-        </w:rPr>
-        <w:t>The team worked collaboratively under a clear separation of concerns, ensuring continuous contribution and seamless integration into the final repository:</w:t>
-      </w:r>
-    </w:p>
-    <w:p>
-      <w:pPr>
-        <w:spacing w:after="80"/>
-      </w:pPr>
-    </w:p>
-    <w:p>
-      <w:pPr>
-        <w:spacing w:after="40"/>
-        <w:ind w:left="720"/>
-      </w:pPr>
-      <w:r>
-        <w:rPr>
-          <w:rFonts w:ascii="Consolas" w:hAnsi="Consolas"/>
-          <w:b w:val="0"/>
-          <w:i w:val="0"/>
-          <w:color w:val="646E78"/>
-          <w:sz w:val="20"/>
-        </w:rPr>
-        <w:t>gantt</w:t>
-      </w:r>
-    </w:p>
-    <w:p>
-      <w:pPr>
-        <w:spacing w:after="40"/>
-        <w:ind w:left="720"/>
-      </w:pPr>
-      <w:r>
-        <w:rPr>
-          <w:rFonts w:ascii="Consolas" w:hAnsi="Consolas"/>
-          <w:b w:val="0"/>
-          <w:i w:val="0"/>
-          <w:color w:val="646E78"/>
-          <w:sz w:val="20"/>
-        </w:rPr>
-        <w:t xml:space="preserve">    title VLM Contradictions Project Gantt</w:t>
-      </w:r>
-    </w:p>
-    <w:p>
-      <w:pPr>
-        <w:spacing w:after="40"/>
-        <w:ind w:left="720"/>
-      </w:pPr>
-      <w:r>
-        <w:rPr>
-          <w:rFonts w:ascii="Consolas" w:hAnsi="Consolas"/>
-          <w:b w:val="0"/>
-          <w:i w:val="0"/>
-          <w:color w:val="646E78"/>
-          <w:sz w:val="20"/>
-        </w:rPr>
-        <w:t xml:space="preserve">    dateFormat  YYYY-MM-DD</w:t>
-      </w:r>
-    </w:p>
-    <w:p>
-      <w:pPr>
-        <w:spacing w:after="40"/>
-        <w:ind w:left="720"/>
-      </w:pPr>
-      <w:r>
-        <w:rPr>
-          <w:rFonts w:ascii="Consolas" w:hAnsi="Consolas"/>
-          <w:b w:val="0"/>
-          <w:i w:val="0"/>
-          <w:color w:val="646E78"/>
-          <w:sz w:val="20"/>
-        </w:rPr>
-        <w:t xml:space="preserve">    section Task 1 (Bac)</w:t>
-      </w:r>
-    </w:p>
-    <w:p>
-      <w:pPr>
-        <w:spacing w:after="40"/>
-        <w:ind w:left="720"/>
-      </w:pPr>
-      <w:r>
-        <w:rPr>
-          <w:rFonts w:ascii="Consolas" w:hAnsi="Consolas"/>
-          <w:b w:val="0"/>
-          <w:i w:val="0"/>
-          <w:color w:val="646E78"/>
-          <w:sz w:val="20"/>
-        </w:rPr>
-        <w:t xml:space="preserve">    Dataset Loader &amp; RegEx Parsing      :active, 2026-05-10, 2026-05-15</w:t>
-      </w:r>
-    </w:p>
-    <w:p>
-      <w:pPr>
-        <w:spacing w:after="40"/>
-        <w:ind w:left="720"/>
-      </w:pPr>
-      <w:r>
-        <w:rPr>
-          <w:rFonts w:ascii="Consolas" w:hAnsi="Consolas"/>
-          <w:b w:val="0"/>
-          <w:i w:val="0"/>
-          <w:color w:val="646E78"/>
-          <w:sz w:val="20"/>
-        </w:rPr>
-        <w:t xml:space="preserve">    Baseline Evaluation &amp; Metrics Calc  :active, 2026-05-15, 2026-05-18</w:t>
-      </w:r>
-    </w:p>
-    <w:p>
-      <w:pPr>
-        <w:spacing w:after="40"/>
-        <w:ind w:left="720"/>
-      </w:pPr>
-      <w:r>
-        <w:rPr>
-          <w:rFonts w:ascii="Consolas" w:hAnsi="Consolas"/>
-          <w:b w:val="0"/>
-          <w:i w:val="0"/>
-          <w:color w:val="646E78"/>
-          <w:sz w:val="20"/>
-        </w:rPr>
-        <w:t xml:space="preserve">    section Task 2 (My)</w:t>
-      </w:r>
-    </w:p>
-    <w:p>
-      <w:pPr>
-        <w:spacing w:after="40"/>
-        <w:ind w:left="720"/>
-      </w:pPr>
-      <w:r>
-        <w:rPr>
-          <w:rFonts w:ascii="Consolas" w:hAnsi="Consolas"/>
-          <w:b w:val="0"/>
-          <w:i w:val="0"/>
-          <w:color w:val="646E78"/>
-          <w:sz w:val="20"/>
-        </w:rPr>
-        <w:t xml:space="preserve">    Hidden State Extraction Hook        :active, 2026-05-13, 2026-05-17</w:t>
-      </w:r>
-    </w:p>
-    <w:p>
-      <w:pPr>
-        <w:spacing w:after="40"/>
-        <w:ind w:left="720"/>
-      </w:pPr>
-      <w:r>
-        <w:rPr>
-          <w:rFonts w:ascii="Consolas" w:hAnsi="Consolas"/>
-          <w:b w:val="0"/>
-          <w:i w:val="0"/>
-          <w:color w:val="646E78"/>
-          <w:sz w:val="20"/>
-        </w:rPr>
-        <w:t xml:space="preserve">    PCA Probing &amp; Clustering Plots      :active, 2026-05-17, 2026-05-20</w:t>
-      </w:r>
-    </w:p>
-    <w:p>
-      <w:pPr>
-        <w:spacing w:after="40"/>
-        <w:ind w:left="720"/>
-      </w:pPr>
-      <w:r>
-        <w:rPr>
-          <w:rFonts w:ascii="Consolas" w:hAnsi="Consolas"/>
-          <w:b w:val="0"/>
-          <w:i w:val="0"/>
-          <w:color w:val="646E78"/>
-          <w:sz w:val="20"/>
-        </w:rPr>
-        <w:t xml:space="preserve">    section Task 3 (Phuong)</w:t>
-      </w:r>
-    </w:p>
-    <w:p>
-      <w:pPr>
-        <w:spacing w:after="40"/>
-        <w:ind w:left="720"/>
-      </w:pPr>
-      <w:r>
-        <w:rPr>
-          <w:rFonts w:ascii="Consolas" w:hAnsi="Consolas"/>
-          <w:b w:val="0"/>
-          <w:i w:val="0"/>
-          <w:color w:val="646E78"/>
-          <w:sz w:val="20"/>
-        </w:rPr>
-        <w:t xml:space="preserve">    Steering Vector &amp; EasySteer Setup   :active, 2026-05-15, 2026-05-21</w:t>
-      </w:r>
-    </w:p>
-    <w:p>
-      <w:pPr>
-        <w:spacing w:after="40"/>
-        <w:ind w:left="720"/>
-      </w:pPr>
-      <w:r>
-        <w:rPr>
-          <w:rFonts w:ascii="Consolas" w:hAnsi="Consolas"/>
-          <w:b w:val="0"/>
-          <w:i w:val="0"/>
-          <w:color w:val="646E78"/>
-          <w:sz w:val="20"/>
-        </w:rPr>
-        <w:t xml:space="preserve">    Grid Search over Scale &amp; Layers     :active, 2026-05-21, 2026-05-24</w:t>
-      </w:r>
-    </w:p>
-    <w:p>
-      <w:pPr>
-        <w:spacing w:after="80"/>
-      </w:pPr>
-    </w:p>
-    <w:p>
-      <w:pPr>
-        <w:pStyle w:val="ListBullet"/>
-        <w:spacing w:after="80" w:line="276" w:lineRule="auto"/>
-      </w:pPr>
-      <w:r>
-        <w:rPr>
-          <w:rFonts w:ascii="Times New Roman" w:hAnsi="Times New Roman"/>
-          <w:b w:val="0"/>
-          <w:i w:val="0"/>
-          <w:color w:val="000000"/>
-          <w:sz w:val="24"/>
-        </w:rPr>
-      </w:r>
-      <w:r>
-        <w:rPr>
-          <w:rFonts w:ascii="Times New Roman" w:hAnsi="Times New Roman"/>
-          <w:b/>
-          <w:i w:val="0"/>
-          <w:color w:val="000000"/>
-          <w:sz w:val="24"/>
-        </w:rPr>
-        <w:t>Nguyen Ba Thanh Bac (Activation Steering)</w:t>
-      </w:r>
-      <w:r>
-        <w:rPr>
-          <w:rFonts w:ascii="Times New Roman" w:hAnsi="Times New Roman"/>
-          <w:b w:val="0"/>
-          <w:i w:val="0"/>
-          <w:color w:val="000000"/>
-          <w:sz w:val="24"/>
-        </w:rPr>
-        <w:t>: Designed the latent steering algorithm. Integrated EasySteer to construct contrastive steer directions. Conducted the grid search over scaling factor $\alpha$ and layers, and built the final interactive Jupyter Playground.</w:t>
-      </w:r>
-    </w:p>
-    <w:p>
-      <w:pPr>
-        <w:pStyle w:val="ListBullet"/>
-        <w:spacing w:after="80" w:line="276" w:lineRule="auto"/>
-      </w:pPr>
-      <w:r>
-        <w:rPr>
-          <w:rFonts w:ascii="Times New Roman" w:hAnsi="Times New Roman"/>
-          <w:b w:val="0"/>
-          <w:i w:val="0"/>
-          <w:color w:val="000000"/>
-          <w:sz w:val="24"/>
-        </w:rPr>
-      </w:r>
-      <w:r>
-        <w:rPr>
-          <w:rFonts w:ascii="Times New Roman" w:hAnsi="Times New Roman"/>
-          <w:b/>
-          <w:i w:val="0"/>
-          <w:color w:val="000000"/>
-          <w:sz w:val="24"/>
-        </w:rPr>
-        <w:t>Nguyen Thi Tra My (Latent Space Probing)</w:t>
-      </w:r>
-      <w:r>
-        <w:rPr>
-          <w:rFonts w:ascii="Times New Roman" w:hAnsi="Times New Roman"/>
-          <w:b w:val="0"/>
-          <w:i w:val="0"/>
-          <w:color w:val="000000"/>
-          <w:sz w:val="24"/>
-        </w:rPr>
-        <w:t>: Built PyTorch hooks to extract hidden activations from Intermediate layers. Implemented the PCA dimensionality reduction module and generated the task representational clustering plots.</w:t>
-      </w:r>
-    </w:p>
-    <w:p>
-      <w:pPr>
-        <w:pStyle w:val="ListBullet"/>
-        <w:spacing w:after="80" w:line="276" w:lineRule="auto"/>
-      </w:pPr>
-      <w:r>
-        <w:rPr>
-          <w:rFonts w:ascii="Times New Roman" w:hAnsi="Times New Roman"/>
-          <w:b w:val="0"/>
-          <w:i w:val="0"/>
-          <w:color w:val="000000"/>
-          <w:sz w:val="24"/>
-        </w:rPr>
-      </w:r>
-      <w:r>
-        <w:rPr>
-          <w:rFonts w:ascii="Times New Roman" w:hAnsi="Times New Roman"/>
-          <w:b/>
-          <w:i w:val="0"/>
-          <w:color w:val="000000"/>
-          <w:sz w:val="24"/>
-        </w:rPr>
-        <w:t>Tran Thi Hoai Phuong (Preprocessing &amp; Pipeline)</w:t>
-      </w:r>
-      <w:r>
-        <w:rPr>
-          <w:rFonts w:ascii="Times New Roman" w:hAnsi="Times New Roman"/>
-          <w:b w:val="0"/>
-          <w:i w:val="0"/>
-          <w:color w:val="000000"/>
-          <w:sz w:val="24"/>
-        </w:rPr>
-        <w:t>: Set up the repository architecture (`/data/`, `/scripts/`, `/report/`). Developed the regex coordinate parser and dataset loaders for POPE, AMBER, MME, and DASH-B. Coded the 2-Stage Conditional Protocol and evaluated baseline performance.</w:t>
-      </w:r>
-    </w:p>
-    <w:p>
-      <w:pPr>
-        <w:spacing w:after="80"/>
-      </w:pPr>
-    </w:p>
-    <w:p>
-      <w:pPr>
-        <w:spacing w:after="240"/>
-        <w:jc w:val="center"/>
-      </w:pPr>
-      <w:r>
-        <w:rPr>
-          <w:rFonts w:ascii="Times New Roman" w:hAnsi="Times New Roman"/>
-          <w:b w:val="0"/>
-          <w:i w:val="0"/>
-          <w:color w:val="C8C8C8"/>
-          <w:sz w:val="20"/>
-        </w:rPr>
-        <w:t>__________________________________________________________________</w:t>
-      </w:r>
-    </w:p>
-    <w:p>
-      <w:pPr>
-        <w:spacing w:after="80"/>
-      </w:pPr>
-    </w:p>
-    <w:p>
-      <w:pPr>
-        <w:keepNext/>
-        <w:spacing w:before="280" w:after="120"/>
-      </w:pPr>
-      <w:r>
-        <w:rPr>
-          <w:rFonts w:ascii="Times New Roman" w:hAnsi="Times New Roman"/>
-          <w:b/>
-          <w:i w:val="0"/>
-          <w:color w:val="0E7490"/>
-          <w:sz w:val="28"/>
-        </w:rPr>
-        <w:t>6. Individual Reflections</w:t>
-      </w:r>
-    </w:p>
-    <w:p>
-      <w:pPr>
-        <w:spacing w:after="80"/>
-      </w:pPr>
-    </w:p>
-    <w:p>
-      <w:pPr>
-        <w:keepNext/>
-        <w:spacing w:before="200" w:after="80"/>
-      </w:pPr>
-      <w:r>
-        <w:rPr>
-          <w:rFonts w:ascii="Times New Roman" w:hAnsi="Times New Roman"/>
-          <w:b/>
-          <w:i w:val="0"/>
-          <w:color w:val="7C3AED"/>
-          <w:sz w:val="24"/>
-        </w:rPr>
-        <w:t>6.1 Reflection by Nguyen Ba Thanh Bac (Activation Steering)</w:t>
-      </w:r>
-    </w:p>
-    <w:p>
-      <w:pPr>
-        <w:spacing w:after="160" w:line="276" w:lineRule="auto"/>
-        <w:jc w:val="left"/>
-      </w:pPr>
-      <w:r>
-        <w:rPr>
-          <w:rFonts w:ascii="Times New Roman" w:hAnsi="Times New Roman"/>
-          <w:b w:val="0"/>
-          <w:i w:val="0"/>
-          <w:color w:val="000000"/>
-          <w:sz w:val="24"/>
-        </w:rPr>
-        <w:t>"As the steering and mitigation lead, I developed the lightweight inference-time steering engine. I integrated the EasySteer framework, computed the contrastive difference vectors, and injected the steering vector. My largest obstacle was managing the trade-off between increasing CELF on negative samples and preventing over-abstention on positive grounding tasks. Conducting a systematic grid search over layers 7-13 and coefficient $\alpha$ allowed me to identify the optimal layer-scale trade-off. This project deepened my understanding of representation engineering and causal latent manipulation without expensive fine-tuning. In the future, I will focus on developing dynamic, input-adaptive steering mechanisms that adjust $\alpha$ automatically based on model confidence." (115 words)</w:t>
-      </w:r>
-    </w:p>
-    <w:p>
-      <w:pPr>
-        <w:spacing w:after="80"/>
-      </w:pPr>
-    </w:p>
-    <w:p>
-      <w:pPr>
-        <w:keepNext/>
-        <w:spacing w:before="200" w:after="80"/>
-      </w:pPr>
-      <w:r>
-        <w:rPr>
-          <w:rFonts w:ascii="Times New Roman" w:hAnsi="Times New Roman"/>
-          <w:b/>
-          <w:i w:val="0"/>
-          <w:color w:val="7C3AED"/>
-          <w:sz w:val="24"/>
-        </w:rPr>
-        <w:t>6.2 Reflection by Nguyen Thi Tra My (Latent Space Probing)</w:t>
-      </w:r>
-    </w:p>
-    <w:p>
-      <w:pPr>
-        <w:spacing w:after="160" w:line="276" w:lineRule="auto"/>
-        <w:jc w:val="left"/>
-      </w:pPr>
-      <w:r>
-        <w:rPr>
-          <w:rFonts w:ascii="Times New Roman" w:hAnsi="Times New Roman"/>
-          <w:b w:val="0"/>
-          <w:i w:val="0"/>
-          <w:color w:val="000000"/>
-          <w:sz w:val="24"/>
-        </w:rPr>
-        <w:t>"My responsibility was to probe the internal representational space of the models to understand the latent cause of the existence-localization contradiction. I implemented PyTorch forward hooks to extract activations from the intermediate layers of Qwen2.5-VL and performed PCA projections. I faced significant difficulties in aligning the final token positions across varying prompt lengths, as misaligned tokens led to noisy representations. Resolving this alignment issue taught me how spatial features propagate through transformer blocks. I gained hands-on experience in interpretability techniques, and learned how tasks are organized topologically in neural layers. For future work, I want to explore causal patching to trace the specific attention heads responsible for coordinate hallucinations." (121 words)</w:t>
-      </w:r>
-    </w:p>
-    <w:p>
-      <w:pPr>
-        <w:spacing w:after="80"/>
-      </w:pPr>
-    </w:p>
-    <w:p>
-      <w:pPr>
-        <w:keepNext/>
-        <w:spacing w:before="200" w:after="80"/>
-      </w:pPr>
-      <w:r>
-        <w:rPr>
-          <w:rFonts w:ascii="Times New Roman" w:hAnsi="Times New Roman"/>
-          <w:b/>
-          <w:i w:val="0"/>
-          <w:color w:val="7C3AED"/>
-          <w:sz w:val="24"/>
-        </w:rPr>
-        <w:t>6.3 Reflection by Tran Thi Hoai Phuong (Preprocessing &amp; Pipeline)</w:t>
-      </w:r>
-    </w:p>
-    <w:p>
-      <w:pPr>
-        <w:spacing w:after="160" w:line="276" w:lineRule="auto"/>
-        <w:jc w:val="left"/>
-      </w:pPr>
-      <w:r>
-        <w:rPr>
-          <w:rFonts w:ascii="Times New Roman" w:hAnsi="Times New Roman"/>
-          <w:b w:val="0"/>
-          <w:i w:val="0"/>
-          <w:color w:val="000000"/>
-          <w:sz w:val="24"/>
-        </w:rPr>
-        <w:t>"In this project, my primary role was setting up the pipeline architecture and pre-processing the diverse datasets. I designed the unified data loader and implemented regular expression patterns to extract bounding boxes from diverse output formats. A major challenge was parsing Qwen’s natural coordinates compared to InternVL’s `&lt;ref&gt;` XML tag format, which frequently caused string-index errors. Overcoming this taught me the importance of robust data sanitization and output validation in VLM evaluation. I gained deep knowledge of visual grounding benchmarks and learned how structural formatting impacts generative models. In the future, I plan to research structured schema constraints (like Instructor or Outlines) during decoding to completely prevent malformed coordinate generations." (120 words)</w:t>
-      </w:r>
-    </w:p>
-    <w:p>
-      <w:pPr>
-        <w:spacing w:after="80"/>
-      </w:pPr>
-    </w:p>
-    <w:p>
-      <w:pPr>
-        <w:spacing w:after="240"/>
-        <w:jc w:val="center"/>
-      </w:pPr>
-      <w:r>
-        <w:rPr>
-          <w:rFonts w:ascii="Times New Roman" w:hAnsi="Times New Roman"/>
-          <w:b w:val="0"/>
-          <w:i w:val="0"/>
-          <w:color w:val="C8C8C8"/>
-          <w:sz w:val="20"/>
-        </w:rPr>
-        <w:t>__________________________________________________________________</w:t>
-      </w:r>
-    </w:p>
-    <w:p>
-      <w:pPr>
-        <w:spacing w:after="80"/>
-      </w:pPr>
-    </w:p>
-    <w:p>
-      <w:pPr>
-        <w:keepNext/>
-        <w:spacing w:before="280" w:after="120"/>
-      </w:pPr>
-      <w:r>
-        <w:rPr>
-          <w:rFonts w:ascii="Times New Roman" w:hAnsi="Times New Roman"/>
-          <w:b/>
-          <w:i w:val="0"/>
-          <w:color w:val="0E7490"/>
-          <w:sz w:val="28"/>
-        </w:rPr>
-        <w:t>7. References</w:t>
-      </w:r>
-    </w:p>
-    <w:p>
-      <w:pPr>
-        <w:spacing w:after="80"/>
-      </w:pPr>
-    </w:p>
-    <w:p>
-      <w:pPr>
-        <w:pStyle w:val="ListBullet"/>
-        <w:spacing w:after="80" w:line="276" w:lineRule="auto"/>
-      </w:pPr>
-      <w:r>
-        <w:rPr>
-          <w:rFonts w:ascii="Times New Roman" w:hAnsi="Times New Roman"/>
-          <w:b w:val="0"/>
-          <w:i w:val="0"/>
-          <w:color w:val="000000"/>
-          <w:sz w:val="24"/>
-        </w:rPr>
-        <w:t xml:space="preserve">Augustin, M., Neuhaus, Y., and Hein, M. (2025). Dash: Detection and assessment of systematic hallucinations of vlms. </w:t>
-      </w:r>
-      <w:r>
-        <w:rPr>
-          <w:rFonts w:ascii="Times New Roman" w:hAnsi="Times New Roman"/>
-          <w:b w:val="0"/>
-          <w:i/>
-          <w:color w:val="000000"/>
-          <w:sz w:val="24"/>
-        </w:rPr>
-        <w:t>arXiv preprint arXiv:2503.23573</w:t>
-      </w:r>
-      <w:r>
-        <w:rPr>
-          <w:rFonts w:ascii="Times New Roman" w:hAnsi="Times New Roman"/>
-          <w:b w:val="0"/>
-          <w:i w:val="0"/>
-          <w:color w:val="000000"/>
-          <w:sz w:val="24"/>
-        </w:rPr>
-        <w:t>.</w:t>
-      </w:r>
-    </w:p>
-    <w:p>
-      <w:pPr>
-        <w:pStyle w:val="ListBullet"/>
-        <w:spacing w:after="80" w:line="276" w:lineRule="auto"/>
-      </w:pPr>
-      <w:r>
-        <w:rPr>
-          <w:rFonts w:ascii="Times New Roman" w:hAnsi="Times New Roman"/>
-          <w:b w:val="0"/>
-          <w:i w:val="0"/>
-          <w:color w:val="000000"/>
-          <w:sz w:val="24"/>
-        </w:rPr>
-        <w:t xml:space="preserve">Fu, C., Chen, P., Shen, Y., Qin, Y., Zhang, M., Lin, X., et al. (2026). MME: A comprehensive evaluation benchmark for multimodal large language models. </w:t>
-      </w:r>
-      <w:r>
-        <w:rPr>
-          <w:rFonts w:ascii="Times New Roman" w:hAnsi="Times New Roman"/>
-          <w:b w:val="0"/>
-          <w:i/>
-          <w:color w:val="000000"/>
-          <w:sz w:val="24"/>
-        </w:rPr>
-        <w:t>In Neural Information Processing Systems Datasets and Benchmarks Track</w:t>
-      </w:r>
-      <w:r>
-        <w:rPr>
-          <w:rFonts w:ascii="Times New Roman" w:hAnsi="Times New Roman"/>
-          <w:b w:val="0"/>
-          <w:i w:val="0"/>
-          <w:color w:val="000000"/>
-          <w:sz w:val="24"/>
-        </w:rPr>
-        <w:t>.</w:t>
-      </w:r>
-    </w:p>
-    <w:p>
-      <w:pPr>
-        <w:pStyle w:val="ListBullet"/>
-        <w:spacing w:after="80" w:line="276" w:lineRule="auto"/>
-      </w:pPr>
-      <w:r>
-        <w:rPr>
-          <w:rFonts w:ascii="Times New Roman" w:hAnsi="Times New Roman"/>
-          <w:b w:val="0"/>
-          <w:i w:val="0"/>
-          <w:color w:val="000000"/>
-          <w:sz w:val="24"/>
-        </w:rPr>
-        <w:t xml:space="preserve">Li, Y., Du, Y., Zhou, K., Wang, J., Zhao, X., and Wen, J. (2023b). Evaluating object hallucination in large vision-language models. </w:t>
-      </w:r>
-      <w:r>
-        <w:rPr>
-          <w:rFonts w:ascii="Times New Roman" w:hAnsi="Times New Roman"/>
-          <w:b w:val="0"/>
-          <w:i/>
-          <w:color w:val="000000"/>
-          <w:sz w:val="24"/>
-        </w:rPr>
-        <w:t>In Proceedings of the 2023 Conference on Empirical Methods in Natural Language Processing (EMNLP)</w:t>
-      </w:r>
-      <w:r>
-        <w:rPr>
-          <w:rFonts w:ascii="Times New Roman" w:hAnsi="Times New Roman"/>
-          <w:b w:val="0"/>
-          <w:i w:val="0"/>
-          <w:color w:val="000000"/>
-          <w:sz w:val="24"/>
-        </w:rPr>
-        <w:t>.</w:t>
-      </w:r>
-    </w:p>
-    <w:p>
-      <w:pPr>
-        <w:pStyle w:val="ListBullet"/>
-        <w:spacing w:after="80" w:line="276" w:lineRule="auto"/>
-      </w:pPr>
-      <w:r>
-        <w:rPr>
-          <w:rFonts w:ascii="Times New Roman" w:hAnsi="Times New Roman"/>
-          <w:b w:val="0"/>
-          <w:i w:val="0"/>
-          <w:color w:val="000000"/>
-          <w:sz w:val="24"/>
-        </w:rPr>
-        <w:t xml:space="preserve">Liu, H., Li, C., Li, Y., and Lee, Y. J. (2024). Improved baselines with visual instruction tuning. </w:t>
-      </w:r>
-      <w:r>
-        <w:rPr>
-          <w:rFonts w:ascii="Times New Roman" w:hAnsi="Times New Roman"/>
-          <w:b w:val="0"/>
-          <w:i/>
-          <w:color w:val="000000"/>
-          <w:sz w:val="24"/>
-        </w:rPr>
-        <w:t>CVPR 2024</w:t>
-      </w:r>
-      <w:r>
-        <w:rPr>
-          <w:rFonts w:ascii="Times New Roman" w:hAnsi="Times New Roman"/>
-          <w:b w:val="0"/>
-          <w:i w:val="0"/>
-          <w:color w:val="000000"/>
-          <w:sz w:val="24"/>
-        </w:rPr>
-        <w:t>.</w:t>
-      </w:r>
-    </w:p>
-    <w:p>
-      <w:pPr>
-        <w:pStyle w:val="ListBullet"/>
-        <w:spacing w:after="80" w:line="276" w:lineRule="auto"/>
-      </w:pPr>
-      <w:r>
-        <w:rPr>
-          <w:rFonts w:ascii="Times New Roman" w:hAnsi="Times New Roman"/>
-          <w:b w:val="0"/>
-          <w:i w:val="0"/>
-          <w:color w:val="000000"/>
-          <w:sz w:val="24"/>
-        </w:rPr>
-        <w:t xml:space="preserve">Team, G., Kamath, A., Ferret, J., Pathak, S., Vieillard, N., et al. (2025). Gemma 3 technical report. </w:t>
-      </w:r>
-      <w:r>
-        <w:rPr>
-          <w:rFonts w:ascii="Times New Roman" w:hAnsi="Times New Roman"/>
-          <w:b w:val="0"/>
-          <w:i/>
-          <w:color w:val="000000"/>
-          <w:sz w:val="24"/>
-        </w:rPr>
-        <w:t>arXiv preprint arXiv:2503.19786</w:t>
-      </w:r>
-      <w:r>
-        <w:rPr>
-          <w:rFonts w:ascii="Times New Roman" w:hAnsi="Times New Roman"/>
-          <w:b w:val="0"/>
-          <w:i w:val="0"/>
-          <w:color w:val="000000"/>
-          <w:sz w:val="24"/>
-        </w:rPr>
-        <w:t>.</w:t>
-      </w:r>
-    </w:p>
-    <w:p>
-      <w:pPr>
-        <w:pStyle w:val="ListBullet"/>
-        <w:spacing w:after="80" w:line="276" w:lineRule="auto"/>
-      </w:pPr>
-      <w:r>
-        <w:rPr>
-          <w:rFonts w:ascii="Times New Roman" w:hAnsi="Times New Roman"/>
-          <w:b w:val="0"/>
-          <w:i w:val="0"/>
-          <w:color w:val="000000"/>
-          <w:sz w:val="24"/>
-        </w:rPr>
-        <w:t xml:space="preserve">Wang, J., Wang, Y., Xu, G., Zhang, J., Gu, Y., Jia, H., et al. (2024). Amber: An llm-free multi-dimensional benchmark for mllms hallucination evaluation. </w:t>
-      </w:r>
-      <w:r>
-        <w:rPr>
-          <w:rFonts w:ascii="Times New Roman" w:hAnsi="Times New Roman"/>
-          <w:b w:val="0"/>
-          <w:i/>
-          <w:color w:val="000000"/>
-          <w:sz w:val="24"/>
-        </w:rPr>
-        <w:t>arXiv preprint arXiv:2311.07397</w:t>
-      </w:r>
-      <w:r>
-        <w:rPr>
-          <w:rFonts w:ascii="Times New Roman" w:hAnsi="Times New Roman"/>
-          <w:b w:val="0"/>
-          <w:i w:val="0"/>
-          <w:color w:val="000000"/>
-          <w:sz w:val="24"/>
-        </w:rPr>
-        <w:t>.</w:t>
-      </w:r>
-    </w:p>
-    <w:p>
-      <w:pPr>
-        <w:pStyle w:val="ListBullet"/>
-        <w:spacing w:after="80" w:line="276" w:lineRule="auto"/>
-      </w:pPr>
-      <w:r>
-        <w:rPr>
-          <w:rFonts w:ascii="Times New Roman" w:hAnsi="Times New Roman"/>
-          <w:b w:val="0"/>
-          <w:i w:val="0"/>
-          <w:color w:val="000000"/>
-          <w:sz w:val="24"/>
-        </w:rPr>
-        <w:t xml:space="preserve">Wang, W., Gao, Z., Gu, L., Pu, H., Cui, L., et al. (2025). Internvl3.5: Advancing open-source multimodal models in versatility, reasoning, and efficiency. </w:t>
-      </w:r>
-      <w:r>
-        <w:rPr>
-          <w:rFonts w:ascii="Times New Roman" w:hAnsi="Times New Roman"/>
-          <w:b w:val="0"/>
-          <w:i/>
-          <w:color w:val="000000"/>
-          <w:sz w:val="24"/>
-        </w:rPr>
-        <w:t>arXiv preprint arXiv:2508.18265</w:t>
-      </w:r>
-      <w:r>
-        <w:rPr>
-          <w:rFonts w:ascii="Times New Roman" w:hAnsi="Times New Roman"/>
-          <w:b w:val="0"/>
-          <w:i w:val="0"/>
-          <w:color w:val="000000"/>
-          <w:sz w:val="24"/>
-        </w:rPr>
-        <w:t>.</w:t>
-      </w:r>
-    </w:p>
-    <w:p>
-      <w:pPr>
-        <w:pStyle w:val="ListBullet"/>
-        <w:spacing w:after="80" w:line="276" w:lineRule="auto"/>
-      </w:pPr>
-      <w:r>
-        <w:rPr>
-          <w:rFonts w:ascii="Times New Roman" w:hAnsi="Times New Roman"/>
-          <w:b w:val="0"/>
-          <w:i w:val="0"/>
-          <w:color w:val="000000"/>
-          <w:sz w:val="24"/>
-        </w:rPr>
-        <w:t xml:space="preserve">Xu, H., Mei, X., Yan, Y., Zhou, R., Zhang, W., et al. (2025). Easysteer: A unified framework for high-performance and extensible llm steering. </w:t>
-      </w:r>
-      <w:r>
-        <w:rPr>
-          <w:rFonts w:ascii="Times New Roman" w:hAnsi="Times New Roman"/>
-          <w:b w:val="0"/>
-          <w:i/>
-          <w:color w:val="000000"/>
-          <w:sz w:val="24"/>
-        </w:rPr>
-        <w:t>arXiv preprint arXiv:2509.25175</w:t>
-      </w:r>
-      <w:r>
-        <w:rPr>
-          <w:rFonts w:ascii="Times New Roman" w:hAnsi="Times New Roman"/>
-          <w:b w:val="0"/>
-          <w:i w:val="0"/>
-          <w:color w:val="000000"/>
-          <w:sz w:val="24"/>
-        </w:rPr>
-        <w:t>.</w:t>
-      </w:r>
-    </w:p>
-    <w:p>
-      <w:pPr>
-        <w:pStyle w:val="ListBullet"/>
-        <w:spacing w:after="80" w:line="276" w:lineRule="auto"/>
-      </w:pPr>
-      <w:r>
-        <w:rPr>
-          <w:rFonts w:ascii="Times New Roman" w:hAnsi="Times New Roman"/>
-          <w:b w:val="0"/>
-          <w:i w:val="0"/>
-          <w:color w:val="000000"/>
-          <w:sz w:val="24"/>
-        </w:rPr>
-        <w:t xml:space="preserve">Zhu, J., Wang, W., Chen, Z., Liu, Z., Ye, S., et al. (2025). Internvl3: Exploring advanced training and test-time recipes for open-source multimodal models. </w:t>
-      </w:r>
-      <w:r>
-        <w:rPr>
-          <w:rFonts w:ascii="Times New Roman" w:hAnsi="Times New Roman"/>
-          <w:b w:val="0"/>
-          <w:i/>
-          <w:color w:val="000000"/>
-          <w:sz w:val="24"/>
-        </w:rPr>
-        <w:t>arXiv preprint arXiv:2504.10479</w:t>
-      </w:r>
-      <w:r>
-        <w:rPr>
-          <w:rFonts w:ascii="Times New Roman" w:hAnsi="Times New Roman"/>
-          <w:b w:val="0"/>
-          <w:i w:val="0"/>
-          <w:color w:val="000000"/>
-          <w:sz w:val="24"/>
-        </w:rPr>
-        <w:t>.</w:t>
-      </w:r>
-    </w:p>
-    <w:p>
-      <w:pPr>
-        <w:spacing w:after="80"/>
-      </w:pPr>
-    </w:p>
-    <w:p>
-      <w:pPr>
-        <w:spacing w:after="240"/>
-        <w:jc w:val="center"/>
-      </w:pPr>
-      <w:r>
-        <w:rPr>
-          <w:rFonts w:ascii="Times New Roman" w:hAnsi="Times New Roman"/>
-          <w:b w:val="0"/>
-          <w:i w:val="0"/>
-          <w:color w:val="C8C8C8"/>
-          <w:sz w:val="20"/>
-        </w:rPr>
-        <w:t>__________________________________________________________________</w:t>
-      </w:r>
-    </w:p>
-    <w:p>
-      <w:pPr>
-        <w:spacing w:after="80"/>
-      </w:pPr>
-    </w:p>
-    <w:p>
-      <w:pPr>
-        <w:keepNext/>
-        <w:spacing w:before="280" w:after="120"/>
-      </w:pPr>
-      <w:r>
-        <w:rPr>
-          <w:rFonts w:ascii="Times New Roman" w:hAnsi="Times New Roman"/>
-          <w:b/>
-          <w:i w:val="0"/>
-          <w:color w:val="0E7490"/>
-          <w:sz w:val="28"/>
-        </w:rPr>
-        <w:t>8. Appendix</w:t>
-      </w:r>
-    </w:p>
-    <w:p>
-      <w:pPr>
-        <w:spacing w:after="80"/>
-      </w:pPr>
-    </w:p>
-    <w:p>
-      <w:pPr>
-        <w:keepNext/>
-        <w:spacing w:before="200" w:after="80"/>
-      </w:pPr>
-      <w:r>
-        <w:rPr>
-          <w:rFonts w:ascii="Times New Roman" w:hAnsi="Times New Roman"/>
-          <w:b/>
-          <w:i w:val="0"/>
-          <w:color w:val="7C3AED"/>
-          <w:sz w:val="24"/>
-        </w:rPr>
-        <w:t>8.1 Prompt Wording Ablation Study</w:t>
-      </w:r>
-    </w:p>
-    <w:p>
-      <w:pPr>
-        <w:spacing w:after="160" w:line="276" w:lineRule="auto"/>
-        <w:jc w:val="left"/>
-      </w:pPr>
-      <w:r>
-        <w:rPr>
-          <w:rFonts w:ascii="Times New Roman" w:hAnsi="Times New Roman"/>
-          <w:b w:val="0"/>
-          <w:i w:val="0"/>
-          <w:color w:val="000000"/>
-          <w:sz w:val="24"/>
-        </w:rPr>
-        <w:t>To ensure the existence-localization contradiction was not an artifact of a single grounding template, we conducted an ablation study using 5 prompt variants for each model family. Table 3 presents the mean CELF score and its standard deviation across prompts, demonstrating that InternVL3.5-8B consistently suffers from 0.0% CELF across all prompt variants, while the Qwen models show higher variance but maintain low overall faithfulness.</w:t>
-      </w:r>
-    </w:p>
-    <w:p>
-      <w:pPr>
-        <w:spacing w:after="80"/>
-      </w:pPr>
-    </w:p>
-    <w:p>
-      <w:pPr>
-        <w:keepNext/>
-        <w:spacing w:before="200" w:after="80"/>
-      </w:pPr>
-      <w:r>
-        <w:rPr>
-          <w:rFonts w:ascii="Times New Roman" w:hAnsi="Times New Roman"/>
-          <w:b/>
-          <w:i w:val="0"/>
-          <w:color w:val="7C3AED"/>
-          <w:sz w:val="24"/>
-        </w:rPr>
-        <w:t>8.2 Qwen Localization Prompt Templates</w:t>
-      </w:r>
-    </w:p>
-    <w:p>
-      <w:pPr>
-        <w:spacing w:after="80" w:line="276" w:lineRule="auto"/>
-        <w:ind w:left="360"/>
-      </w:pPr>
-      <w:r>
-        <w:rPr>
-          <w:rFonts w:ascii="Times New Roman" w:hAnsi="Times New Roman"/>
-          <w:b/>
-          <w:i w:val="0"/>
-          <w:color w:val="000000"/>
-          <w:sz w:val="24"/>
-        </w:rPr>
-        <w:t xml:space="preserve">1. </w:t>
-      </w:r>
-      <w:r>
-        <w:rPr>
-          <w:rFonts w:ascii="Times New Roman" w:hAnsi="Times New Roman"/>
-          <w:b w:val="0"/>
-          <w:i w:val="0"/>
-          <w:color w:val="000000"/>
-          <w:sz w:val="24"/>
-        </w:rPr>
-      </w:r>
-      <w:r>
-        <w:rPr>
-          <w:rFonts w:ascii="Times New Roman" w:hAnsi="Times New Roman"/>
-          <w:b w:val="0"/>
-          <w:i/>
-          <w:color w:val="000000"/>
-          <w:sz w:val="24"/>
-        </w:rPr>
-        <w:t>"Locate a/an {object} in the image and identify its bounding box if it exists."</w:t>
-      </w:r>
-      <w:r>
-        <w:rPr>
-          <w:rFonts w:ascii="Times New Roman" w:hAnsi="Times New Roman"/>
-          <w:b w:val="0"/>
-          <w:i w:val="0"/>
-          <w:color w:val="000000"/>
-          <w:sz w:val="24"/>
-        </w:rPr>
-        <w:t xml:space="preserve"> (Default)</w:t>
-      </w:r>
-    </w:p>
-    <w:p>
-      <w:pPr>
-        <w:spacing w:after="80" w:line="276" w:lineRule="auto"/>
-        <w:ind w:left="360"/>
-      </w:pPr>
-      <w:r>
-        <w:rPr>
-          <w:rFonts w:ascii="Times New Roman" w:hAnsi="Times New Roman"/>
-          <w:b/>
-          <w:i w:val="0"/>
-          <w:color w:val="000000"/>
-          <w:sz w:val="24"/>
-        </w:rPr>
-        <w:t xml:space="preserve">2. </w:t>
-      </w:r>
-      <w:r>
-        <w:rPr>
-          <w:rFonts w:ascii="Times New Roman" w:hAnsi="Times New Roman"/>
-          <w:b w:val="0"/>
-          <w:i w:val="0"/>
-          <w:color w:val="000000"/>
-          <w:sz w:val="24"/>
-        </w:rPr>
-      </w:r>
-      <w:r>
-        <w:rPr>
-          <w:rFonts w:ascii="Times New Roman" w:hAnsi="Times New Roman"/>
-          <w:b w:val="0"/>
-          <w:i/>
-          <w:color w:val="000000"/>
-          <w:sz w:val="24"/>
-        </w:rPr>
-        <w:t>"Locate a/an {object} in the image and identify its bounding box."</w:t>
-      </w:r>
-      <w:r>
-        <w:rPr>
-          <w:rFonts w:ascii="Times New Roman" w:hAnsi="Times New Roman"/>
-          <w:b w:val="0"/>
-          <w:i w:val="0"/>
-          <w:color w:val="000000"/>
-          <w:sz w:val="24"/>
-        </w:rPr>
-      </w:r>
-    </w:p>
-    <w:p>
-      <w:pPr>
-        <w:spacing w:after="80" w:line="276" w:lineRule="auto"/>
-        <w:ind w:left="360"/>
-      </w:pPr>
-      <w:r>
-        <w:rPr>
-          <w:rFonts w:ascii="Times New Roman" w:hAnsi="Times New Roman"/>
-          <w:b/>
-          <w:i w:val="0"/>
-          <w:color w:val="000000"/>
-          <w:sz w:val="24"/>
-        </w:rPr>
-        <w:t xml:space="preserve">3. </w:t>
-      </w:r>
-      <w:r>
-        <w:rPr>
-          <w:rFonts w:ascii="Times New Roman" w:hAnsi="Times New Roman"/>
-          <w:b w:val="0"/>
-          <w:i w:val="0"/>
-          <w:color w:val="000000"/>
-          <w:sz w:val="24"/>
-        </w:rPr>
-      </w:r>
-      <w:r>
-        <w:rPr>
-          <w:rFonts w:ascii="Times New Roman" w:hAnsi="Times New Roman"/>
-          <w:b w:val="0"/>
-          <w:i/>
-          <w:color w:val="000000"/>
-          <w:sz w:val="24"/>
-        </w:rPr>
-        <w:t>"Search the image for a/an {object} and provide its bounding box if it is visible."</w:t>
-      </w:r>
-      <w:r>
-        <w:rPr>
-          <w:rFonts w:ascii="Times New Roman" w:hAnsi="Times New Roman"/>
-          <w:b w:val="0"/>
-          <w:i w:val="0"/>
-          <w:color w:val="000000"/>
-          <w:sz w:val="24"/>
-        </w:rPr>
-      </w:r>
-    </w:p>
-    <w:p>
-      <w:pPr>
-        <w:spacing w:after="80" w:line="276" w:lineRule="auto"/>
-        <w:ind w:left="360"/>
-      </w:pPr>
-      <w:r>
-        <w:rPr>
-          <w:rFonts w:ascii="Times New Roman" w:hAnsi="Times New Roman"/>
-          <w:b/>
-          <w:i w:val="0"/>
-          <w:color w:val="000000"/>
-          <w:sz w:val="24"/>
-        </w:rPr>
-        <w:t xml:space="preserve">4. </w:t>
-      </w:r>
-      <w:r>
-        <w:rPr>
-          <w:rFonts w:ascii="Times New Roman" w:hAnsi="Times New Roman"/>
-          <w:b w:val="0"/>
-          <w:i w:val="0"/>
-          <w:color w:val="000000"/>
-          <w:sz w:val="24"/>
-        </w:rPr>
-      </w:r>
-      <w:r>
-        <w:rPr>
-          <w:rFonts w:ascii="Times New Roman" w:hAnsi="Times New Roman"/>
-          <w:b w:val="0"/>
-          <w:i/>
-          <w:color w:val="000000"/>
-          <w:sz w:val="24"/>
-        </w:rPr>
-        <w:t>"Detect all instances of {object} in the image and return their locations in the form of coordinates."</w:t>
-      </w:r>
-      <w:r>
-        <w:rPr>
-          <w:rFonts w:ascii="Times New Roman" w:hAnsi="Times New Roman"/>
-          <w:b w:val="0"/>
-          <w:i w:val="0"/>
-          <w:color w:val="000000"/>
-          <w:sz w:val="24"/>
-        </w:rPr>
-      </w:r>
-    </w:p>
-    <w:p>
-      <w:pPr>
-        <w:spacing w:after="80" w:line="276" w:lineRule="auto"/>
-        <w:ind w:left="360"/>
-      </w:pPr>
-      <w:r>
-        <w:rPr>
-          <w:rFonts w:ascii="Times New Roman" w:hAnsi="Times New Roman"/>
-          <w:b/>
-          <w:i w:val="0"/>
-          <w:color w:val="000000"/>
-          <w:sz w:val="24"/>
-        </w:rPr>
-        <w:t xml:space="preserve">5. </w:t>
-      </w:r>
-      <w:r>
-        <w:rPr>
-          <w:rFonts w:ascii="Times New Roman" w:hAnsi="Times New Roman"/>
-          <w:b w:val="0"/>
-          <w:i w:val="0"/>
-          <w:color w:val="000000"/>
-          <w:sz w:val="24"/>
-        </w:rPr>
-      </w:r>
-      <w:r>
-        <w:rPr>
-          <w:rFonts w:ascii="Times New Roman" w:hAnsi="Times New Roman"/>
-          <w:b w:val="0"/>
-          <w:i/>
-          <w:color w:val="000000"/>
-          <w:sz w:val="24"/>
-        </w:rPr>
-        <w:t>"Identify a/an {object} within the picture and provide its bounding box if present."</w:t>
-      </w:r>
-      <w:r>
-        <w:rPr>
-          <w:rFonts w:ascii="Times New Roman" w:hAnsi="Times New Roman"/>
-          <w:b w:val="0"/>
-          <w:i w:val="0"/>
-          <w:color w:val="000000"/>
-          <w:sz w:val="24"/>
-        </w:rPr>
-      </w:r>
-    </w:p>
-    <w:p>
-      <w:pPr>
-        <w:spacing w:after="80"/>
-      </w:pPr>
-    </w:p>
-    <w:p>
-      <w:pPr>
-        <w:keepNext/>
-        <w:spacing w:before="200" w:after="80"/>
-      </w:pPr>
-      <w:r>
-        <w:rPr>
-          <w:rFonts w:ascii="Times New Roman" w:hAnsi="Times New Roman"/>
-          <w:b/>
-          <w:i w:val="0"/>
-          <w:color w:val="7C3AED"/>
-          <w:sz w:val="24"/>
-        </w:rPr>
-        <w:t>8.3 InternVL Referring Expression Templates</w:t>
+        <w:t>InternVL Referring Expression Templates</w:t>
       </w:r>
     </w:p>
     <w:p>

</xml_diff>